<commit_message>
Final editions and pdfs
</commit_message>
<xml_diff>
--- a/final proj ds4420 report.docx
+++ b/final proj ds4420 report.docx
@@ -720,13 +720,27 @@
           <w:rFonts w:ascii="Times New Roman" w:hAnsi="Times New Roman" w:cs="Times New Roman"/>
           <w:szCs w:val="22"/>
         </w:rPr>
-        <w:t>The dataset was sourced from the National Structure Inventory (NSI) 2022, which provides comprehensive building</w:t>
+        <w:t xml:space="preserve">The dataset was sourced from the National Structure Inventory (NSI) 2022, </w:t>
       </w:r>
       <w:r>
         <w:rPr>
           <w:rFonts w:ascii="Times New Roman" w:hAnsi="Times New Roman" w:cs="Times New Roman"/>
           <w:szCs w:val="22"/>
         </w:rPr>
+        <w:t>it</w:t>
+      </w:r>
+      <w:r>
+        <w:rPr>
+          <w:rFonts w:ascii="Times New Roman" w:hAnsi="Times New Roman" w:cs="Times New Roman"/>
+          <w:szCs w:val="22"/>
+        </w:rPr>
+        <w:t xml:space="preserve"> provides comprehensive building</w:t>
+      </w:r>
+      <w:r>
+        <w:rPr>
+          <w:rFonts w:ascii="Times New Roman" w:hAnsi="Times New Roman" w:cs="Times New Roman"/>
+          <w:szCs w:val="22"/>
+        </w:rPr>
         <w:t>-</w:t>
       </w:r>
       <w:r>
@@ -748,12 +762,70 @@
           <w:rFonts w:ascii="Times New Roman" w:hAnsi="Times New Roman" w:cs="Times New Roman"/>
           <w:szCs w:val="22"/>
         </w:rPr>
-        <w:t xml:space="preserve"> including foundation type, ground elevation, building type, and structural value for all U.S. structures. The Massachusetts subset of 153,239 structures was extracted to focus the analysis on a consistent region. The binary flood risk target was derived from the </w:t>
+        <w:t xml:space="preserve"> </w:t>
+      </w:r>
+      <w:r>
+        <w:rPr>
+          <w:rFonts w:ascii="Times New Roman" w:hAnsi="Times New Roman" w:cs="Times New Roman"/>
+          <w:szCs w:val="22"/>
+        </w:rPr>
+        <w:t xml:space="preserve">has </w:t>
+      </w:r>
+      <w:r>
+        <w:rPr>
+          <w:rFonts w:ascii="Times New Roman" w:hAnsi="Times New Roman" w:cs="Times New Roman"/>
+          <w:szCs w:val="22"/>
+        </w:rPr>
+        <w:t xml:space="preserve">including foundation type, ground elevation, building type, and structural value for all US structures. </w:t>
+      </w:r>
+      <w:r>
+        <w:rPr>
+          <w:rFonts w:ascii="Times New Roman" w:hAnsi="Times New Roman" w:cs="Times New Roman"/>
+          <w:szCs w:val="22"/>
+        </w:rPr>
+        <w:t xml:space="preserve">We only focused on the Massachusetts </w:t>
+      </w:r>
+      <w:proofErr w:type="gramStart"/>
+      <w:r>
+        <w:rPr>
+          <w:rFonts w:ascii="Times New Roman" w:hAnsi="Times New Roman" w:cs="Times New Roman"/>
+          <w:szCs w:val="22"/>
+        </w:rPr>
+        <w:t>subset</w:t>
+      </w:r>
+      <w:proofErr w:type="gramEnd"/>
+      <w:r>
+        <w:rPr>
+          <w:rFonts w:ascii="Times New Roman" w:hAnsi="Times New Roman" w:cs="Times New Roman"/>
+          <w:szCs w:val="22"/>
+        </w:rPr>
+        <w:t xml:space="preserve"> and it has more than 2 million datasets, and</w:t>
+      </w:r>
+      <w:r>
+        <w:rPr>
+          <w:rFonts w:ascii="Times New Roman" w:hAnsi="Times New Roman" w:cs="Times New Roman"/>
+          <w:szCs w:val="22"/>
+        </w:rPr>
+        <w:t xml:space="preserve"> 153,239 structures </w:t>
+      </w:r>
+      <w:r>
+        <w:rPr>
+          <w:rFonts w:ascii="Times New Roman" w:hAnsi="Times New Roman" w:cs="Times New Roman"/>
+          <w:szCs w:val="22"/>
+        </w:rPr>
+        <w:t xml:space="preserve">of them </w:t>
+      </w:r>
+      <w:r>
+        <w:rPr>
+          <w:rFonts w:ascii="Times New Roman" w:hAnsi="Times New Roman" w:cs="Times New Roman"/>
+          <w:szCs w:val="22"/>
+        </w:rPr>
+        <w:t xml:space="preserve">was extracted to focus the analysis on a consistent region. The binary flood risk target was derived from the </w:t>
       </w:r>
       <w:proofErr w:type="spellStart"/>
       <w:r>
         <w:rPr>
-          <w:rStyle w:val="HTMLCode"/>
+          <w:rStyle w:val="HTML"/>
           <w:rFonts w:ascii="Times New Roman" w:eastAsiaTheme="majorEastAsia" w:hAnsi="Times New Roman" w:cs="Times New Roman"/>
           <w:sz w:val="22"/>
           <w:szCs w:val="22"/>
@@ -784,7 +856,7 @@
       </w:r>
       <w:r>
         <w:rPr>
-          <w:rStyle w:val="HTMLCode"/>
+          <w:rStyle w:val="HTML"/>
           <w:rFonts w:ascii="Times New Roman" w:eastAsiaTheme="majorEastAsia" w:hAnsi="Times New Roman" w:cs="Times New Roman"/>
           <w:sz w:val="22"/>
           <w:szCs w:val="22"/>
@@ -796,13 +868,55 @@
           <w:rFonts w:ascii="Times New Roman" w:hAnsi="Times New Roman" w:cs="Times New Roman"/>
           <w:szCs w:val="22"/>
         </w:rPr>
-        <w:t xml:space="preserve"> was labeled high risk, aligning with FEMA's Special Flood Hazard Area classifications. Features were selected based on their structural and geographic relevance to flood vulnerability</w:t>
+        <w:t xml:space="preserve"> </w:t>
       </w:r>
       <w:r>
         <w:rPr>
           <w:rFonts w:ascii="Times New Roman" w:hAnsi="Times New Roman" w:cs="Times New Roman"/>
           <w:szCs w:val="22"/>
         </w:rPr>
+        <w:t>has been</w:t>
+      </w:r>
+      <w:r>
+        <w:rPr>
+          <w:rFonts w:ascii="Times New Roman" w:hAnsi="Times New Roman" w:cs="Times New Roman"/>
+          <w:szCs w:val="22"/>
+        </w:rPr>
+        <w:t xml:space="preserve"> labeled </w:t>
+      </w:r>
+      <w:r>
+        <w:rPr>
+          <w:rFonts w:ascii="Times New Roman" w:hAnsi="Times New Roman" w:cs="Times New Roman"/>
+          <w:szCs w:val="22"/>
+        </w:rPr>
+        <w:t xml:space="preserve">as </w:t>
+      </w:r>
+      <w:r>
+        <w:rPr>
+          <w:rFonts w:ascii="Times New Roman" w:hAnsi="Times New Roman" w:cs="Times New Roman"/>
+          <w:szCs w:val="22"/>
+        </w:rPr>
+        <w:t xml:space="preserve">high risk, aligning with FEMA's Special Flood Hazard Area classifications. Features </w:t>
+      </w:r>
+      <w:r>
+        <w:rPr>
+          <w:rFonts w:ascii="Times New Roman" w:hAnsi="Times New Roman" w:cs="Times New Roman"/>
+          <w:szCs w:val="22"/>
+        </w:rPr>
+        <w:t>had been</w:t>
+      </w:r>
+      <w:r>
+        <w:rPr>
+          <w:rFonts w:ascii="Times New Roman" w:hAnsi="Times New Roman" w:cs="Times New Roman"/>
+          <w:szCs w:val="22"/>
+        </w:rPr>
+        <w:t xml:space="preserve"> selected based on their structural and geographic relevance to flood vulnerability</w:t>
+      </w:r>
+      <w:r>
+        <w:rPr>
+          <w:rFonts w:ascii="Times New Roman" w:hAnsi="Times New Roman" w:cs="Times New Roman"/>
+          <w:szCs w:val="22"/>
+        </w:rPr>
         <w:t>. A</w:t>
       </w:r>
       <w:r>
@@ -810,13 +924,20 @@
           <w:rFonts w:ascii="Times New Roman" w:hAnsi="Times New Roman" w:cs="Times New Roman"/>
           <w:szCs w:val="22"/>
         </w:rPr>
-        <w:t>ll preprocessing</w:t>
+        <w:t>ll preprocess</w:t>
       </w:r>
       <w:r>
         <w:rPr>
           <w:rFonts w:ascii="Times New Roman" w:hAnsi="Times New Roman" w:cs="Times New Roman"/>
           <w:szCs w:val="22"/>
         </w:rPr>
+        <w:t xml:space="preserve"> steps</w:t>
+      </w:r>
+      <w:r>
+        <w:rPr>
+          <w:rFonts w:ascii="Times New Roman" w:hAnsi="Times New Roman" w:cs="Times New Roman"/>
+          <w:szCs w:val="22"/>
+        </w:rPr>
         <w:t>,</w:t>
       </w:r>
       <w:r>
@@ -831,7 +952,21 @@
           <w:rFonts w:ascii="Times New Roman" w:hAnsi="Times New Roman" w:cs="Times New Roman"/>
           <w:szCs w:val="22"/>
         </w:rPr>
-        <w:t>, was applied before training.</w:t>
+        <w:t xml:space="preserve">, was applied before </w:t>
+      </w:r>
+      <w:r>
+        <w:rPr>
+          <w:rFonts w:ascii="Times New Roman" w:hAnsi="Times New Roman" w:cs="Times New Roman"/>
+          <w:szCs w:val="22"/>
+        </w:rPr>
+        <w:t xml:space="preserve">the </w:t>
+      </w:r>
+      <w:r>
+        <w:rPr>
+          <w:rFonts w:ascii="Times New Roman" w:hAnsi="Times New Roman" w:cs="Times New Roman"/>
+          <w:szCs w:val="22"/>
+        </w:rPr>
+        <w:t>training.</w:t>
       </w:r>
     </w:p>
     <w:p>
@@ -981,6 +1116,7 @@
         <w:rPr>
           <w:rFonts w:ascii="Times New Roman" w:hAnsi="Times New Roman" w:cs="Times New Roman"/>
         </w:rPr>
+        <w:lastRenderedPageBreak/>
         <w:t xml:space="preserve">The network architecture consists of </w:t>
       </w:r>
       <w:proofErr w:type="gramStart"/>
@@ -995,14 +1131,7 @@
         <w:rPr>
           <w:rFonts w:ascii="Times New Roman" w:hAnsi="Times New Roman" w:cs="Times New Roman"/>
         </w:rPr>
-        <w:t xml:space="preserve"> input layer corresponding to the dimensional feature space d, a single hidden layer with 16 nodes, and an output layer with a single node. The </w:t>
-      </w:r>
-      <w:r>
-        <w:rPr>
-          <w:rFonts w:ascii="Times New Roman" w:hAnsi="Times New Roman" w:cs="Times New Roman"/>
-        </w:rPr>
-        <w:lastRenderedPageBreak/>
-        <w:t>forward propagation utilizes a Rectified Linear Unit (</w:t>
+        <w:t xml:space="preserve"> input layer corresponding to the dimensional feature space d, a single hidden layer with 16 nodes, and an output layer with a single node. The forward propagation utilizes a Rectified Linear Unit (</w:t>
       </w:r>
       <w:proofErr w:type="spellStart"/>
       <w:r>
@@ -1240,6 +1369,7 @@
           <w:rFonts w:ascii="Times New Roman" w:hAnsi="Times New Roman" w:cs="Times New Roman"/>
           <w:b/>
           <w:bCs/>
+          <w:szCs w:val="22"/>
         </w:rPr>
       </w:pPr>
       <w:r>
@@ -1247,6 +1377,7 @@
           <w:rFonts w:ascii="Times New Roman" w:hAnsi="Times New Roman" w:cs="Times New Roman"/>
           <w:b/>
           <w:bCs/>
+          <w:szCs w:val="22"/>
         </w:rPr>
         <w:t xml:space="preserve">Bayesian </w:t>
       </w:r>
@@ -1255,48 +1386,85 @@
           <w:rFonts w:ascii="Times New Roman" w:hAnsi="Times New Roman" w:cs="Times New Roman"/>
           <w:b/>
           <w:bCs/>
-        </w:rPr>
-        <w:t xml:space="preserve">Logistic Regression </w:t>
-      </w:r>
-      <w:r>
-        <w:rPr>
-          <w:rFonts w:ascii="Times New Roman" w:hAnsi="Times New Roman" w:cs="Times New Roman"/>
-          <w:b/>
-          <w:bCs/>
-        </w:rPr>
-        <w:t>Architecture and Implementation</w:t>
-      </w:r>
-    </w:p>
-    <w:p>
-      <w:pPr>
-        <w:spacing w:line="240" w:lineRule="auto"/>
-        <w:rPr>
-          <w:rFonts w:ascii="Times New Roman" w:hAnsi="Times New Roman" w:cs="Times New Roman"/>
-        </w:rPr>
-      </w:pPr>
-      <w:r>
-        <w:rPr>
-          <w:rFonts w:ascii="Times New Roman" w:hAnsi="Times New Roman" w:cs="Times New Roman"/>
-        </w:rPr>
-        <w:t>To complement the MLP with a probabilistic approach, a Bayesian Logistic Regression (BLR) model was implemented to identify high-risk flood zones based on the same structural building characteristics.</w:t>
-      </w:r>
-      <w:r>
-        <w:rPr>
-          <w:rFonts w:ascii="Times New Roman" w:hAnsi="Times New Roman" w:cs="Times New Roman"/>
-        </w:rPr>
-        <w:t xml:space="preserve"> </w:t>
-      </w:r>
-      <w:r>
-        <w:rPr>
-          <w:rFonts w:ascii="Times New Roman" w:hAnsi="Times New Roman" w:cs="Times New Roman"/>
-        </w:rPr>
-        <w:t>Unlike the MLP which produces point estimates, the BLR places probability distributions over model weights, enabling uncertainty quantification for each prediction. The model was implemented using the</w:t>
-      </w:r>
-      <w:r>
-        <w:rPr>
-          <w:rFonts w:ascii="Times New Roman" w:hAnsi="Times New Roman" w:cs="Times New Roman"/>
-        </w:rPr>
-        <w:t xml:space="preserve"> </w:t>
+          <w:szCs w:val="22"/>
+        </w:rPr>
+        <w:t>Logistic Regression Architecture and Implementation</w:t>
+      </w:r>
+    </w:p>
+    <w:p>
+      <w:pPr>
+        <w:spacing w:line="240" w:lineRule="auto"/>
+        <w:rPr>
+          <w:rFonts w:ascii="Times New Roman" w:hAnsi="Times New Roman" w:cs="Times New Roman"/>
+        </w:rPr>
+      </w:pPr>
+      <w:r>
+        <w:rPr>
+          <w:rFonts w:ascii="Times New Roman" w:hAnsi="Times New Roman" w:cs="Times New Roman"/>
+        </w:rPr>
+        <w:t xml:space="preserve">To complement the MLP with a probabilistic approach, </w:t>
+      </w:r>
+      <w:proofErr w:type="gramStart"/>
+      <w:r>
+        <w:rPr>
+          <w:rFonts w:ascii="Times New Roman" w:hAnsi="Times New Roman" w:cs="Times New Roman"/>
+        </w:rPr>
+        <w:t>a</w:t>
+      </w:r>
+      <w:r>
+        <w:rPr>
+          <w:rFonts w:ascii="Times New Roman" w:hAnsi="Times New Roman" w:cs="Times New Roman"/>
+        </w:rPr>
+        <w:t>n</w:t>
+      </w:r>
+      <w:proofErr w:type="gramEnd"/>
+      <w:r>
+        <w:rPr>
+          <w:rFonts w:ascii="Times New Roman" w:hAnsi="Times New Roman" w:cs="Times New Roman"/>
+        </w:rPr>
+        <w:t xml:space="preserve"> Bayesian Logistic Regression (BLR) model was implemented to identify high-risk flood zones based on the same structural building characteristics.</w:t>
+      </w:r>
+      <w:r>
+        <w:rPr>
+          <w:rFonts w:ascii="Times New Roman" w:hAnsi="Times New Roman" w:cs="Times New Roman"/>
+        </w:rPr>
+        <w:t xml:space="preserve"> Unlike the MLP which produce</w:t>
+      </w:r>
+      <w:r>
+        <w:rPr>
+          <w:rFonts w:ascii="Times New Roman" w:hAnsi="Times New Roman" w:cs="Times New Roman"/>
+        </w:rPr>
+        <w:t>d</w:t>
+      </w:r>
+      <w:r>
+        <w:rPr>
+          <w:rFonts w:ascii="Times New Roman" w:hAnsi="Times New Roman" w:cs="Times New Roman"/>
+        </w:rPr>
+        <w:t xml:space="preserve"> point estimates, the BLR place</w:t>
+      </w:r>
+      <w:r>
+        <w:rPr>
+          <w:rFonts w:ascii="Times New Roman" w:hAnsi="Times New Roman" w:cs="Times New Roman"/>
+        </w:rPr>
+        <w:t>d</w:t>
+      </w:r>
+      <w:r>
+        <w:rPr>
+          <w:rFonts w:ascii="Times New Roman" w:hAnsi="Times New Roman" w:cs="Times New Roman"/>
+        </w:rPr>
+        <w:t xml:space="preserve"> probability distribution over model weights, enabl</w:t>
+      </w:r>
+      <w:r>
+        <w:rPr>
+          <w:rFonts w:ascii="Times New Roman" w:hAnsi="Times New Roman" w:cs="Times New Roman"/>
+        </w:rPr>
+        <w:t>ed</w:t>
+      </w:r>
+      <w:r>
+        <w:rPr>
+          <w:rFonts w:ascii="Times New Roman" w:hAnsi="Times New Roman" w:cs="Times New Roman"/>
+        </w:rPr>
+        <w:t xml:space="preserve"> uncertainty quantification for each prediction. The model was implemented using the </w:t>
       </w:r>
       <w:proofErr w:type="spellStart"/>
       <w:r>
@@ -1310,51 +1478,39 @@
         <w:rPr>
           <w:rFonts w:ascii="Times New Roman" w:hAnsi="Times New Roman" w:cs="Times New Roman"/>
         </w:rPr>
-        <w:t xml:space="preserve"> </w:t>
-      </w:r>
-      <w:r>
-        <w:rPr>
-          <w:rFonts w:ascii="Times New Roman" w:hAnsi="Times New Roman" w:cs="Times New Roman"/>
-        </w:rPr>
-        <w:t xml:space="preserve">package in R, which </w:t>
-      </w:r>
-      <w:r>
-        <w:rPr>
-          <w:rFonts w:ascii="Times New Roman" w:hAnsi="Times New Roman" w:cs="Times New Roman"/>
-        </w:rPr>
-        <w:t>uses</w:t>
-      </w:r>
-      <w:r>
-        <w:rPr>
-          <w:rFonts w:ascii="Times New Roman" w:hAnsi="Times New Roman" w:cs="Times New Roman"/>
-        </w:rPr>
-        <w:t xml:space="preserve"> the No-U-Turn Sampler (NUTS), an adaptive extension of Hamiltonian Monte Carlo.</w:t>
-      </w:r>
-    </w:p>
-    <w:p>
-      <w:pPr>
-        <w:spacing w:line="240" w:lineRule="auto"/>
-        <w:rPr>
-          <w:rFonts w:ascii="Times New Roman" w:hAnsi="Times New Roman" w:cs="Times New Roman"/>
-        </w:rPr>
-      </w:pPr>
-      <w:r>
-        <w:rPr>
-          <w:rFonts w:ascii="Times New Roman" w:hAnsi="Times New Roman" w:cs="Times New Roman"/>
-        </w:rPr>
-        <w:t>The likelihood function assumes a Bernoulli distribution for the binary flood risk outcome</w:t>
-      </w:r>
-      <w:r>
-        <w:rPr>
-          <w:rFonts w:ascii="Times New Roman" w:hAnsi="Times New Roman" w:cs="Times New Roman"/>
-        </w:rPr>
-        <w:t xml:space="preserve"> </w:t>
-      </w:r>
-      <w:r>
-        <w:rPr>
-          <w:rFonts w:ascii="Times New Roman" w:hAnsi="Times New Roman" w:cs="Times New Roman"/>
-        </w:rPr>
-        <w:t>with the probability parameterized through the logistic sigmoid function:</w:t>
+        <w:t xml:space="preserve"> package in R, which uses the No-U-Turn Sampler (NUTS), an adaptive extension of Hamiltonian Monte Carlo.</w:t>
+      </w:r>
+    </w:p>
+    <w:p>
+      <w:pPr>
+        <w:spacing w:line="240" w:lineRule="auto"/>
+        <w:rPr>
+          <w:rFonts w:ascii="Times New Roman" w:hAnsi="Times New Roman" w:cs="Times New Roman"/>
+        </w:rPr>
+      </w:pPr>
+      <w:r>
+        <w:rPr>
+          <w:rFonts w:ascii="Times New Roman" w:hAnsi="Times New Roman" w:cs="Times New Roman"/>
+        </w:rPr>
+        <w:t>The likelihood function assume</w:t>
+      </w:r>
+      <w:r>
+        <w:rPr>
+          <w:rFonts w:ascii="Times New Roman" w:hAnsi="Times New Roman" w:cs="Times New Roman"/>
+        </w:rPr>
+        <w:t>d</w:t>
+      </w:r>
+      <w:r>
+        <w:rPr>
+          <w:rFonts w:ascii="Times New Roman" w:hAnsi="Times New Roman" w:cs="Times New Roman"/>
+        </w:rPr>
+        <w:t xml:space="preserve"> a Bernoulli distribution for the binary flood risk outcome</w:t>
+      </w:r>
+      <w:r>
+        <w:rPr>
+          <w:rFonts w:ascii="Times New Roman" w:hAnsi="Times New Roman" w:cs="Times New Roman"/>
+        </w:rPr>
+        <w:t xml:space="preserve"> with the probability parameterized through the logistic sigmoid function:</w:t>
       </w:r>
     </w:p>
     <w:p>
@@ -1429,13 +1585,7 @@
             <w:rPr>
               <w:rFonts w:ascii="Cambria Math" w:hAnsi="Cambria Math" w:cs="Times New Roman"/>
             </w:rPr>
-            <m:t xml:space="preserve"> ~ Bern(</m:t>
-          </m:r>
-          <m:r>
-            <w:rPr>
-              <w:rFonts w:ascii="Cambria Math" w:hAnsi="Cambria Math" w:cs="Times New Roman"/>
-            </w:rPr>
-            <m:t>θ=σ(</m:t>
+            <m:t xml:space="preserve"> ~ Bern(θ=σ(</m:t>
           </m:r>
           <m:sSup>
             <m:sSupPr>
@@ -1709,7 +1859,7 @@
         <w:rPr>
           <w:rFonts w:ascii="Times New Roman" w:hAnsi="Times New Roman" w:cs="Times New Roman"/>
         </w:rPr>
-        <w:t xml:space="preserve">Weakly informative priors were placed over all model weights to regularize the posterior while allowing the data to </w:t>
+        <w:t xml:space="preserve">Weak informative priors were placed over all model weights to regularize the posterior while allowing the data to </w:t>
       </w:r>
       <w:r>
         <w:rPr>
@@ -1721,7 +1871,19 @@
         <w:rPr>
           <w:rFonts w:ascii="Times New Roman" w:hAnsi="Times New Roman" w:cs="Times New Roman"/>
         </w:rPr>
-        <w:t>. Feature weights were assigned a Normal prior centered at zero with a standard deviation of 2.5, while the intercept was given a wider prior to allow the</w:t>
+        <w:t>. Feature</w:t>
+      </w:r>
+      <w:r>
+        <w:rPr>
+          <w:rFonts w:ascii="Times New Roman" w:hAnsi="Times New Roman" w:cs="Times New Roman"/>
+        </w:rPr>
+        <w:t>s’</w:t>
+      </w:r>
+      <w:r>
+        <w:rPr>
+          <w:rFonts w:ascii="Times New Roman" w:hAnsi="Times New Roman" w:cs="Times New Roman"/>
+        </w:rPr>
+        <w:t xml:space="preserve"> weights were assigned a Normal prior centered at zero with a standard deviation of 2.5, while the intercept was given a wider prior to allow the</w:t>
       </w:r>
       <w:r>
         <w:rPr>
@@ -1808,13 +1970,7 @@
             <w:rPr>
               <w:rFonts w:ascii="Cambria Math" w:hAnsi="Cambria Math"/>
             </w:rPr>
-            <m:t>) for j=1, ...</m:t>
-          </m:r>
-          <m:r>
-            <w:rPr>
-              <w:rFonts w:ascii="Cambria Math" w:hAnsi="Cambria Math"/>
-            </w:rPr>
-            <m:t>, 15</m:t>
+            <m:t>) for j=1, ..., 15</m:t>
           </m:r>
         </m:oMath>
       </m:oMathPara>
@@ -1919,7 +2075,31 @@
         <w:rPr>
           <w:rFonts w:ascii="Times New Roman" w:hAnsi="Times New Roman" w:cs="Times New Roman"/>
         </w:rPr>
-        <w:t>The posterior distribution over all 16 weights was computed via Bayes' theorem:</w:t>
+        <w:t>The posterior distribution over all 16 weights w</w:t>
+      </w:r>
+      <w:r>
+        <w:rPr>
+          <w:rFonts w:ascii="Times New Roman" w:hAnsi="Times New Roman" w:cs="Times New Roman"/>
+        </w:rPr>
+        <w:t>ere</w:t>
+      </w:r>
+      <w:r>
+        <w:rPr>
+          <w:rFonts w:ascii="Times New Roman" w:hAnsi="Times New Roman" w:cs="Times New Roman"/>
+        </w:rPr>
+        <w:t xml:space="preserve"> computed </w:t>
+      </w:r>
+      <w:r>
+        <w:rPr>
+          <w:rFonts w:ascii="Times New Roman" w:hAnsi="Times New Roman" w:cs="Times New Roman"/>
+        </w:rPr>
+        <w:t>by</w:t>
+      </w:r>
+      <w:r>
+        <w:rPr>
+          <w:rFonts w:ascii="Times New Roman" w:hAnsi="Times New Roman" w:cs="Times New Roman"/>
+        </w:rPr>
+        <w:t xml:space="preserve"> Bayes' theorem:</w:t>
       </w:r>
     </w:p>
     <w:p>
@@ -1939,6 +2119,7 @@
             <w:rPr>
               <w:rFonts w:ascii="Cambria Math" w:hAnsi="Cambria Math"/>
             </w:rPr>
+            <w:lastRenderedPageBreak/>
             <m:t>p</m:t>
           </m:r>
           <m:d>
@@ -2055,20 +2236,25 @@
         <w:rPr>
           <w:rFonts w:ascii="Times New Roman" w:hAnsi="Times New Roman" w:cs="Times New Roman"/>
         </w:rPr>
-        <w:lastRenderedPageBreak/>
-        <w:t>Posterior inference was conducted using 4 independent MCMC chains, each running 1000 iterations with 500 warmup iterations discarded, yielding 2000 posterior draws. Predictions were obtained by averaging the posterior predictive probabilities across all 2000 draws</w:t>
-      </w:r>
-      <w:r>
-        <w:rPr>
-          <w:rFonts w:ascii="Times New Roman" w:hAnsi="Times New Roman" w:cs="Times New Roman"/>
-        </w:rPr>
-        <w:t xml:space="preserve">, </w:t>
-      </w:r>
-      <w:r>
-        <w:rPr>
-          <w:rFonts w:ascii="Times New Roman" w:hAnsi="Times New Roman" w:cs="Times New Roman"/>
-        </w:rPr>
-        <w:t>with observations classified as high risk when the mean predicted probability exceeded 0.5.</w:t>
+        <w:t>Posterior inference was conducted using 4 independent MCMC chains, each running 1000 iterations with 500 warmup iterations discarded, yielding 2000 posterior draws. Predictions w</w:t>
+      </w:r>
+      <w:r>
+        <w:rPr>
+          <w:rFonts w:ascii="Times New Roman" w:hAnsi="Times New Roman" w:cs="Times New Roman"/>
+        </w:rPr>
+        <w:t>as</w:t>
+      </w:r>
+      <w:r>
+        <w:rPr>
+          <w:rFonts w:ascii="Times New Roman" w:hAnsi="Times New Roman" w:cs="Times New Roman"/>
+        </w:rPr>
+        <w:t xml:space="preserve"> obtained by averaging the posterior predictive probabilities across all 2000 draws</w:t>
+      </w:r>
+      <w:r>
+        <w:rPr>
+          <w:rFonts w:ascii="Times New Roman" w:hAnsi="Times New Roman" w:cs="Times New Roman"/>
+        </w:rPr>
+        <w:t>, with observations classified as high risk when the mean predicted probability exceeded 0.5.</w:t>
       </w:r>
     </w:p>
     <w:p>
@@ -2287,7 +2473,7 @@
       </w:pPr>
       <w:r>
         <w:rPr>
-          <w:rStyle w:val="Strong"/>
+          <w:rStyle w:val="af"/>
           <w:rFonts w:eastAsiaTheme="majorEastAsia"/>
           <w:sz w:val="22"/>
           <w:szCs w:val="22"/>
@@ -2308,72 +2494,142 @@
           <w:sz w:val="22"/>
           <w:szCs w:val="22"/>
         </w:rPr>
-        <w:t>The Bayesian Logistic Regression model demonstrated strong predictive capabilities on the unseen test set. The model achieved an overall Accuracy of 92.52%, reflecting a high reliability in classifying building vulnerability across the Massachusetts region.</w:t>
-      </w:r>
-    </w:p>
-    <w:p>
-      <w:pPr>
-        <w:pStyle w:val="font-claude-response-body"/>
+        <w:t>The Bayesian Logistic Regression model demonstrate</w:t>
+      </w:r>
+      <w:r>
         <w:rPr>
           <w:sz w:val="22"/>
           <w:szCs w:val="22"/>
         </w:rPr>
-      </w:pPr>
+        <w:t>s</w:t>
+      </w:r>
       <w:r>
         <w:rPr>
           <w:sz w:val="22"/>
           <w:szCs w:val="22"/>
         </w:rPr>
-        <w:t>Further evaluation using the Confusion Matrix reveals a favorable balance between</w:t>
+        <w:t xml:space="preserve"> strong predictive capabilities on the unseen test set. The model achieve</w:t>
       </w:r>
       <w:r>
         <w:rPr>
           <w:sz w:val="22"/>
           <w:szCs w:val="22"/>
         </w:rPr>
-        <w:t xml:space="preserve"> recall</w:t>
+        <w:t>s</w:t>
       </w:r>
       <w:r>
         <w:rPr>
           <w:sz w:val="22"/>
           <w:szCs w:val="22"/>
         </w:rPr>
-        <w:t xml:space="preserve"> and precision. The model achieved a Precision of 0.8890 and a Recall of 0.7675, culminating in an F1-Score of 0.8238. While the Recall is lower than that of the MLP, the Precision of 0.8890 indicates that when the model predicts a structure as high risk, it is correct nearly 89% </w:t>
-      </w:r>
-      <w:r>
+        <w:t xml:space="preserve"> an overall Accuracy of 92.52%, reflecting a high reliability in classifying building vulnerability across the Massachusetts region.</w:t>
+      </w:r>
+    </w:p>
+    <w:p>
+      <w:pPr>
+        <w:pStyle w:val="font-claude-response-body"/>
         <w:rPr>
           <w:sz w:val="22"/>
           <w:szCs w:val="22"/>
         </w:rPr>
-        <w:lastRenderedPageBreak/>
-        <w:t>of the time. In the context of municipal flood risk planning, this ensures that resources directed toward flagged structures are well</w:t>
-      </w:r>
+      </w:pPr>
       <w:r>
         <w:rPr>
           <w:sz w:val="22"/>
           <w:szCs w:val="22"/>
         </w:rPr>
-        <w:t xml:space="preserve"> </w:t>
+        <w:t xml:space="preserve">Further evaluation </w:t>
       </w:r>
       <w:r>
         <w:rPr>
           <w:sz w:val="22"/>
           <w:szCs w:val="22"/>
         </w:rPr>
-        <w:t xml:space="preserve">targeted and not </w:t>
+        <w:t xml:space="preserve">by </w:t>
       </w:r>
       <w:r>
         <w:rPr>
           <w:sz w:val="22"/>
           <w:szCs w:val="22"/>
         </w:rPr>
-        <w:t>distracted</w:t>
+        <w:t xml:space="preserve">using the Confusion Matrix </w:t>
       </w:r>
       <w:r>
         <w:rPr>
           <w:sz w:val="22"/>
           <w:szCs w:val="22"/>
         </w:rPr>
+        <w:t xml:space="preserve">has </w:t>
+      </w:r>
+      <w:r>
+        <w:rPr>
+          <w:sz w:val="22"/>
+          <w:szCs w:val="22"/>
+        </w:rPr>
+        <w:t>reveals a favorable balance between</w:t>
+      </w:r>
+      <w:r>
+        <w:rPr>
+          <w:sz w:val="22"/>
+          <w:szCs w:val="22"/>
+        </w:rPr>
+        <w:t xml:space="preserve"> recall</w:t>
+      </w:r>
+      <w:r>
+        <w:rPr>
+          <w:sz w:val="22"/>
+          <w:szCs w:val="22"/>
+        </w:rPr>
+        <w:t xml:space="preserve"> and precision. The model achieved a Precision of 0.8890 and Recall of 0.7675, culminating in an F1-Score of 0.8238. While the Recall is lower than that of the MLP, the </w:t>
+      </w:r>
+      <w:r>
+        <w:rPr>
+          <w:sz w:val="22"/>
+          <w:szCs w:val="22"/>
+        </w:rPr>
+        <w:lastRenderedPageBreak/>
+        <w:t>Precision of 0.8890 indicates that when the model predicts a structure as high risk, it is correct nearly 89% of the time. In the context of municipal flood risk planning, this ensure</w:t>
+      </w:r>
+      <w:r>
+        <w:rPr>
+          <w:sz w:val="22"/>
+          <w:szCs w:val="22"/>
+        </w:rPr>
+        <w:t>d</w:t>
+      </w:r>
+      <w:r>
+        <w:rPr>
+          <w:sz w:val="22"/>
+          <w:szCs w:val="22"/>
+        </w:rPr>
+        <w:t xml:space="preserve"> that resources directed toward flagged structures are well</w:t>
+      </w:r>
+      <w:r>
+        <w:rPr>
+          <w:sz w:val="22"/>
+          <w:szCs w:val="22"/>
+        </w:rPr>
+        <w:t xml:space="preserve"> </w:t>
+      </w:r>
+      <w:r>
+        <w:rPr>
+          <w:sz w:val="22"/>
+          <w:szCs w:val="22"/>
+        </w:rPr>
+        <w:t xml:space="preserve">target and not </w:t>
+      </w:r>
+      <w:r>
+        <w:rPr>
+          <w:sz w:val="22"/>
+          <w:szCs w:val="22"/>
+        </w:rPr>
+        <w:t>distracted</w:t>
+      </w:r>
+      <w:r>
+        <w:rPr>
+          <w:sz w:val="22"/>
+          <w:szCs w:val="22"/>
+        </w:rPr>
         <w:t xml:space="preserve"> by excessive false positives.</w:t>
       </w:r>
     </w:p>
@@ -2428,61 +2684,43 @@
         <w:rPr>
           <w:rFonts w:ascii="Times New Roman" w:hAnsi="Times New Roman" w:cs="Times New Roman"/>
         </w:rPr>
+        <w:t xml:space="preserve"> This is very intuitive since</w:t>
+      </w:r>
+      <w:r>
+        <w:rPr>
+          <w:rFonts w:ascii="Times New Roman" w:hAnsi="Times New Roman" w:cs="Times New Roman"/>
+        </w:rPr>
+        <w:t xml:space="preserve"> they are the main structures located in coastal and riverine flood zones</w:t>
+      </w:r>
+      <w:r>
+        <w:rPr>
+          <w:rFonts w:ascii="Times New Roman" w:hAnsi="Times New Roman" w:cs="Times New Roman"/>
+        </w:rPr>
+        <w:t>.</w:t>
+      </w:r>
+      <w:r>
+        <w:rPr>
+          <w:rFonts w:ascii="Times New Roman" w:hAnsi="Times New Roman" w:cs="Times New Roman"/>
+        </w:rPr>
         <w:t xml:space="preserve"> </w:t>
       </w:r>
       <w:r>
         <w:rPr>
           <w:rFonts w:ascii="Times New Roman" w:hAnsi="Times New Roman" w:cs="Times New Roman"/>
         </w:rPr>
-        <w:t xml:space="preserve">This is </w:t>
-      </w:r>
-      <w:r>
-        <w:rPr>
-          <w:rFonts w:ascii="Times New Roman" w:hAnsi="Times New Roman" w:cs="Times New Roman"/>
-        </w:rPr>
-        <w:t>very</w:t>
-      </w:r>
-      <w:r>
-        <w:rPr>
-          <w:rFonts w:ascii="Times New Roman" w:hAnsi="Times New Roman" w:cs="Times New Roman"/>
-        </w:rPr>
-        <w:t xml:space="preserve"> intuitive</w:t>
-      </w:r>
-      <w:r>
-        <w:rPr>
-          <w:rFonts w:ascii="Times New Roman" w:hAnsi="Times New Roman" w:cs="Times New Roman"/>
-        </w:rPr>
-        <w:t xml:space="preserve"> since</w:t>
-      </w:r>
-      <w:r>
-        <w:rPr>
-          <w:rFonts w:ascii="Times New Roman" w:hAnsi="Times New Roman" w:cs="Times New Roman"/>
-        </w:rPr>
-        <w:t xml:space="preserve"> they are the main </w:t>
-      </w:r>
-      <w:r>
-        <w:rPr>
-          <w:rFonts w:ascii="Times New Roman" w:hAnsi="Times New Roman" w:cs="Times New Roman"/>
-        </w:rPr>
-        <w:t>structures located in coastal and riverine flood zones</w:t>
-      </w:r>
-      <w:r>
-        <w:rPr>
-          <w:rFonts w:ascii="Times New Roman" w:hAnsi="Times New Roman" w:cs="Times New Roman"/>
-        </w:rPr>
-        <w:t>.</w:t>
-      </w:r>
-      <w:r>
-        <w:rPr>
-          <w:rFonts w:ascii="Times New Roman" w:hAnsi="Times New Roman" w:cs="Times New Roman"/>
-        </w:rPr>
-        <w:t xml:space="preserve"> </w:t>
-      </w:r>
-      <w:r>
-        <w:rPr>
-          <w:rFonts w:ascii="Times New Roman" w:hAnsi="Times New Roman" w:cs="Times New Roman"/>
-        </w:rPr>
-        <w:t>Ground elevation (</w:t>
+        <w:t>Ground elevation</w:t>
+      </w:r>
+      <w:r>
+        <w:rPr>
+          <w:rFonts w:ascii="Times New Roman" w:hAnsi="Times New Roman" w:cs="Times New Roman"/>
+        </w:rPr>
+        <w:t>s</w:t>
+      </w:r>
+      <w:r>
+        <w:rPr>
+          <w:rFonts w:ascii="Times New Roman" w:hAnsi="Times New Roman" w:cs="Times New Roman"/>
+        </w:rPr>
+        <w:t xml:space="preserve"> (</w:t>
       </w:r>
       <w:proofErr w:type="spellStart"/>
       <w:r>
@@ -2496,7 +2734,19 @@
         <w:rPr>
           <w:rFonts w:ascii="Times New Roman" w:hAnsi="Times New Roman" w:cs="Times New Roman"/>
         </w:rPr>
-        <w:t>) exhibits the strongest negative coefficient across all features, confirming that higher elevation is the most robust protective factor against flood risk designation.</w:t>
+        <w:t>) exhibits the strongest negative coefficient across all features, confirm</w:t>
+      </w:r>
+      <w:r>
+        <w:rPr>
+          <w:rFonts w:ascii="Times New Roman" w:hAnsi="Times New Roman" w:cs="Times New Roman"/>
+        </w:rPr>
+        <w:t>ed</w:t>
+      </w:r>
+      <w:r>
+        <w:rPr>
+          <w:rFonts w:ascii="Times New Roman" w:hAnsi="Times New Roman" w:cs="Times New Roman"/>
+        </w:rPr>
+        <w:t xml:space="preserve"> that higher elevation is the most robust protective factor against flood risk designation.</w:t>
       </w:r>
     </w:p>
     <w:p>
@@ -2614,21 +2864,39 @@
         <w:rPr>
           <w:rFonts w:ascii="Times New Roman" w:hAnsi="Times New Roman" w:cs="Times New Roman"/>
         </w:rPr>
-        <w:t>While the custom MLP achieved high predictive accuracy, a primary drawback of this approach is its "</w:t>
+        <w:t xml:space="preserve">While the custom MLP achieved high predictive </w:t>
       </w:r>
       <w:proofErr w:type="gramStart"/>
       <w:r>
         <w:rPr>
           <w:rFonts w:ascii="Times New Roman" w:hAnsi="Times New Roman" w:cs="Times New Roman"/>
         </w:rPr>
-        <w:t>black-box</w:t>
+        <w:t>accuracy</w:t>
+      </w:r>
+      <w:r>
+        <w:rPr>
+          <w:rFonts w:ascii="Times New Roman" w:hAnsi="Times New Roman" w:cs="Times New Roman"/>
+        </w:rPr>
+        <w:t>(</w:t>
       </w:r>
       <w:proofErr w:type="gramEnd"/>
       <w:r>
         <w:rPr>
           <w:rFonts w:ascii="Times New Roman" w:hAnsi="Times New Roman" w:cs="Times New Roman"/>
         </w:rPr>
-        <w:t xml:space="preserve">" nature. </w:t>
+        <w:t>93.97%)</w:t>
+      </w:r>
+      <w:r>
+        <w:rPr>
+          <w:rFonts w:ascii="Times New Roman" w:hAnsi="Times New Roman" w:cs="Times New Roman" w:hint="eastAsia"/>
+        </w:rPr>
+        <w:t>,</w:t>
+      </w:r>
+      <w:r>
+        <w:rPr>
+          <w:rFonts w:ascii="Times New Roman" w:hAnsi="Times New Roman" w:cs="Times New Roman"/>
+        </w:rPr>
+        <w:t xml:space="preserve"> a primary drawback of this approach is its "black-box" nature. </w:t>
       </w:r>
       <w:r>
         <w:rPr>
@@ -2778,7 +3046,19 @@
         <w:rPr>
           <w:rFonts w:ascii="Times New Roman" w:hAnsi="Times New Roman" w:cs="Times New Roman"/>
         </w:rPr>
-        <w:t>The Bayesian Logistic Regression achieved 92.52% accuracy while providing interpretable posterior coefficient estimates</w:t>
+        <w:t>The Bayesian Logistic Regression achieved 92.52% accuracy while provid</w:t>
+      </w:r>
+      <w:r>
+        <w:rPr>
+          <w:rFonts w:ascii="Times New Roman" w:hAnsi="Times New Roman" w:cs="Times New Roman"/>
+        </w:rPr>
+        <w:t>e</w:t>
+      </w:r>
+      <w:r>
+        <w:rPr>
+          <w:rFonts w:ascii="Times New Roman" w:hAnsi="Times New Roman" w:cs="Times New Roman"/>
+        </w:rPr>
+        <w:t xml:space="preserve"> interpretable posterior coefficient estimates</w:t>
       </w:r>
       <w:r>
         <w:rPr>
@@ -2802,37 +3082,14 @@
         <w:rPr>
           <w:rFonts w:ascii="Times New Roman" w:hAnsi="Times New Roman" w:cs="Times New Roman"/>
         </w:rPr>
-        <w:t xml:space="preserve">the model </w:t>
-      </w:r>
-      <w:r>
-        <w:rPr>
-          <w:rFonts w:ascii="Times New Roman" w:hAnsi="Times New Roman" w:cs="Times New Roman"/>
-        </w:rPr>
-        <w:t>limits its ability to capture complex non-linear interactions,</w:t>
-      </w:r>
-      <w:r>
-        <w:rPr>
-          <w:rFonts w:ascii="Times New Roman" w:hAnsi="Times New Roman" w:cs="Times New Roman"/>
-        </w:rPr>
-        <w:t xml:space="preserve"> which </w:t>
-      </w:r>
-      <w:r>
-        <w:rPr>
-          <w:rFonts w:ascii="Times New Roman" w:hAnsi="Times New Roman" w:cs="Times New Roman"/>
-        </w:rPr>
-        <w:t xml:space="preserve">lower </w:t>
-      </w:r>
-      <w:r>
-        <w:rPr>
-          <w:rFonts w:ascii="Times New Roman" w:hAnsi="Times New Roman" w:cs="Times New Roman"/>
-        </w:rPr>
-        <w:t>R</w:t>
-      </w:r>
-      <w:r>
-        <w:rPr>
-          <w:rFonts w:ascii="Times New Roman" w:hAnsi="Times New Roman" w:cs="Times New Roman"/>
-        </w:rPr>
-        <w:t>ecall of 0.7675 compared to the MLP.</w:t>
+        <w:t xml:space="preserve">the model limits its ability to capture complex non-linear interactions, which lower Recall of 0.7675 </w:t>
+      </w:r>
+      <w:r>
+        <w:rPr>
+          <w:rFonts w:ascii="Times New Roman" w:hAnsi="Times New Roman" w:cs="Times New Roman"/>
+        </w:rPr>
+        <w:lastRenderedPageBreak/>
+        <w:t>compared to the MLP.</w:t>
       </w:r>
     </w:p>
     <w:p>
@@ -2850,7 +3107,6 @@
           <w:b/>
           <w:bCs/>
         </w:rPr>
-        <w:lastRenderedPageBreak/>
         <w:t>Future work</w:t>
       </w:r>
     </w:p>
@@ -2871,7 +3127,19 @@
         <w:rPr>
           <w:rFonts w:ascii="Times New Roman" w:hAnsi="Times New Roman" w:cs="Times New Roman"/>
         </w:rPr>
-        <w:t>the implementation of a Bayesian Neural Network (BNN)</w:t>
+        <w:t>the implementation of a Bayesian Neural Network (BNN) would address the primary limitations of both models by combining the predictive capacity of deep neural networks with uncertainty quantification</w:t>
+      </w:r>
+      <w:r>
+        <w:rPr>
+          <w:rFonts w:ascii="Times New Roman" w:hAnsi="Times New Roman" w:cs="Times New Roman"/>
+        </w:rPr>
+        <w:t xml:space="preserve">. A BNN could potentially achieve higher recall on high-risk structures without sacrificing the </w:t>
+      </w:r>
+      <w:r>
+        <w:rPr>
+          <w:rFonts w:ascii="Times New Roman" w:hAnsi="Times New Roman" w:cs="Times New Roman"/>
+        </w:rPr>
+        <w:t>uncertainty estimation</w:t>
       </w:r>
       <w:r>
         <w:rPr>
@@ -2883,48 +3151,6 @@
         <w:rPr>
           <w:rFonts w:ascii="Times New Roman" w:hAnsi="Times New Roman" w:cs="Times New Roman"/>
         </w:rPr>
-        <w:t>would address the primary limitations of both models by combining the predictive capacity of deep neural networks with uncertainty quantification</w:t>
-      </w:r>
-      <w:r>
-        <w:rPr>
-          <w:rFonts w:ascii="Times New Roman" w:hAnsi="Times New Roman" w:cs="Times New Roman"/>
-        </w:rPr>
-        <w:t xml:space="preserve">. </w:t>
-      </w:r>
-      <w:r>
-        <w:rPr>
-          <w:rFonts w:ascii="Times New Roman" w:hAnsi="Times New Roman" w:cs="Times New Roman"/>
-        </w:rPr>
-        <w:t>A BNN could potentially achieve higher recall on high</w:t>
-      </w:r>
-      <w:r>
-        <w:rPr>
-          <w:rFonts w:ascii="Times New Roman" w:hAnsi="Times New Roman" w:cs="Times New Roman"/>
-        </w:rPr>
-        <w:t>-</w:t>
-      </w:r>
-      <w:r>
-        <w:rPr>
-          <w:rFonts w:ascii="Times New Roman" w:hAnsi="Times New Roman" w:cs="Times New Roman"/>
-        </w:rPr>
-        <w:t xml:space="preserve">risk structures without sacrificing the </w:t>
-      </w:r>
-      <w:r>
-        <w:rPr>
-          <w:rFonts w:ascii="Times New Roman" w:hAnsi="Times New Roman" w:cs="Times New Roman"/>
-        </w:rPr>
-        <w:t>uncertainty estimation</w:t>
-      </w:r>
-      <w:r>
-        <w:rPr>
-          <w:rFonts w:ascii="Times New Roman" w:hAnsi="Times New Roman" w:cs="Times New Roman"/>
-        </w:rPr>
-        <w:t xml:space="preserve"> </w:t>
-      </w:r>
-      <w:r>
-        <w:rPr>
-          <w:rFonts w:ascii="Times New Roman" w:hAnsi="Times New Roman" w:cs="Times New Roman"/>
-        </w:rPr>
         <w:t>of</w:t>
       </w:r>
       <w:r>
@@ -2937,13 +3163,7 @@
         <w:rPr>
           <w:rFonts w:ascii="Times New Roman" w:hAnsi="Times New Roman" w:cs="Times New Roman"/>
         </w:rPr>
-        <w:t xml:space="preserve"> </w:t>
-      </w:r>
-      <w:r>
-        <w:rPr>
-          <w:rFonts w:ascii="Times New Roman" w:hAnsi="Times New Roman" w:cs="Times New Roman"/>
-        </w:rPr>
-        <w:t>Incorporating spatial features such as coastlines and elevation relative to base flood elevation would also likely improve predictive performance across both approaches.</w:t>
+        <w:t xml:space="preserve"> Incorporating spatial features such as coastlines and elevation relative to base flood elevation would also likely improve predictive performance across both approaches.</w:t>
       </w:r>
     </w:p>
     <w:p>
@@ -3811,6 +4031,7 @@
           <w:sz w:val="16"/>
           <w:szCs w:val="16"/>
         </w:rPr>
+        <w:lastRenderedPageBreak/>
         <w:t xml:space="preserve">    return sigmoid(h.dot(W2) + b2)</w:t>
       </w:r>
     </w:p>
@@ -4982,6 +5203,7 @@
           <w:sz w:val="16"/>
           <w:szCs w:val="16"/>
         </w:rPr>
+        <w:lastRenderedPageBreak/>
         <w:t xml:space="preserve">            </w:t>
       </w:r>
       <w:proofErr w:type="gramStart"/>
@@ -5029,7 +5251,6 @@
           <w:rFonts w:ascii="Times New Roman" w:hAnsi="Times New Roman" w:cs="Times New Roman"/>
           <w:sz w:val="24"/>
         </w:rPr>
-        <w:lastRenderedPageBreak/>
         <w:t>--------------------------------------------------------------------</w:t>
       </w:r>
     </w:p>
@@ -5046,486 +5267,11 @@
       <w:pPr>
         <w:spacing w:line="240" w:lineRule="auto"/>
         <w:rPr>
-          <w:rFonts w:ascii="Times New Roman" w:hAnsi="Times New Roman" w:cs="Times New Roman"/>
-          <w:szCs w:val="22"/>
-        </w:rPr>
-      </w:pPr>
-      <w:r>
-        <w:rPr>
-          <w:rFonts w:ascii="Times New Roman" w:hAnsi="Times New Roman" w:cs="Times New Roman"/>
-          <w:szCs w:val="22"/>
-        </w:rPr>
-        <w:t>BLR</w:t>
-      </w:r>
-      <w:r>
-        <w:rPr>
-          <w:rFonts w:ascii="Times New Roman" w:hAnsi="Times New Roman" w:cs="Times New Roman"/>
-          <w:szCs w:val="22"/>
-        </w:rPr>
-        <w:t xml:space="preserve"> In R:</w:t>
-      </w:r>
-    </w:p>
-    <w:p>
-      <w:pPr>
-        <w:spacing w:line="240" w:lineRule="auto"/>
-        <w:rPr>
-          <w:rFonts w:ascii="Consolas" w:hAnsi="Consolas" w:cs="Consolas"/>
-          <w:color w:val="275317" w:themeColor="accent6" w:themeShade="80"/>
-          <w:sz w:val="16"/>
-          <w:szCs w:val="16"/>
-        </w:rPr>
-      </w:pPr>
-      <w:proofErr w:type="spellStart"/>
-      <w:r>
-        <w:rPr>
-          <w:rFonts w:ascii="Consolas" w:hAnsi="Consolas" w:cs="Consolas"/>
-          <w:color w:val="275317" w:themeColor="accent6" w:themeShade="80"/>
-          <w:sz w:val="16"/>
-          <w:szCs w:val="16"/>
-        </w:rPr>
-        <w:t>blr_model</w:t>
-      </w:r>
-      <w:proofErr w:type="spellEnd"/>
-      <w:r>
-        <w:rPr>
-          <w:rFonts w:ascii="Consolas" w:hAnsi="Consolas" w:cs="Consolas"/>
-          <w:color w:val="275317" w:themeColor="accent6" w:themeShade="80"/>
-          <w:sz w:val="16"/>
-          <w:szCs w:val="16"/>
-        </w:rPr>
-        <w:t xml:space="preserve"> &lt;- </w:t>
-      </w:r>
-      <w:proofErr w:type="spellStart"/>
-      <w:r>
-        <w:rPr>
-          <w:rFonts w:ascii="Consolas" w:hAnsi="Consolas" w:cs="Consolas"/>
-          <w:color w:val="275317" w:themeColor="accent6" w:themeShade="80"/>
-          <w:sz w:val="16"/>
-          <w:szCs w:val="16"/>
-        </w:rPr>
-        <w:t>stan_</w:t>
-      </w:r>
-      <w:proofErr w:type="gramStart"/>
-      <w:r>
-        <w:rPr>
-          <w:rFonts w:ascii="Consolas" w:hAnsi="Consolas" w:cs="Consolas"/>
-          <w:color w:val="275317" w:themeColor="accent6" w:themeShade="80"/>
-          <w:sz w:val="16"/>
-          <w:szCs w:val="16"/>
-        </w:rPr>
-        <w:t>glm</w:t>
-      </w:r>
-      <w:proofErr w:type="spellEnd"/>
-      <w:r>
-        <w:rPr>
-          <w:rFonts w:ascii="Consolas" w:hAnsi="Consolas" w:cs="Consolas"/>
-          <w:color w:val="275317" w:themeColor="accent6" w:themeShade="80"/>
-          <w:sz w:val="16"/>
-          <w:szCs w:val="16"/>
-        </w:rPr>
-        <w:t>(</w:t>
-      </w:r>
-      <w:proofErr w:type="gramEnd"/>
-    </w:p>
-    <w:p>
-      <w:pPr>
-        <w:spacing w:line="240" w:lineRule="auto"/>
-        <w:rPr>
-          <w:rFonts w:ascii="Consolas" w:hAnsi="Consolas" w:cs="Consolas"/>
-          <w:color w:val="275317" w:themeColor="accent6" w:themeShade="80"/>
-          <w:sz w:val="16"/>
-          <w:szCs w:val="16"/>
-        </w:rPr>
-      </w:pPr>
-      <w:r>
-        <w:rPr>
-          <w:rFonts w:ascii="Consolas" w:hAnsi="Consolas" w:cs="Consolas"/>
-          <w:color w:val="275317" w:themeColor="accent6" w:themeShade="80"/>
-          <w:sz w:val="16"/>
-          <w:szCs w:val="16"/>
-        </w:rPr>
-        <w:t xml:space="preserve">  </w:t>
-      </w:r>
-      <w:proofErr w:type="spellStart"/>
-      <w:r>
-        <w:rPr>
-          <w:rFonts w:ascii="Consolas" w:hAnsi="Consolas" w:cs="Consolas"/>
-          <w:color w:val="275317" w:themeColor="accent6" w:themeShade="80"/>
-          <w:sz w:val="16"/>
-          <w:szCs w:val="16"/>
-        </w:rPr>
-        <w:t>target_label</w:t>
-      </w:r>
-      <w:proofErr w:type="spellEnd"/>
-      <w:r>
-        <w:rPr>
-          <w:rFonts w:ascii="Consolas" w:hAnsi="Consolas" w:cs="Consolas"/>
-          <w:color w:val="275317" w:themeColor="accent6" w:themeShade="80"/>
-          <w:sz w:val="16"/>
-          <w:szCs w:val="16"/>
-        </w:rPr>
-        <w:t xml:space="preserve"> </w:t>
-      </w:r>
-      <w:proofErr w:type="gramStart"/>
-      <w:r>
-        <w:rPr>
-          <w:rFonts w:ascii="Consolas" w:hAnsi="Consolas" w:cs="Consolas"/>
-          <w:color w:val="275317" w:themeColor="accent6" w:themeShade="80"/>
-          <w:sz w:val="16"/>
-          <w:szCs w:val="16"/>
-        </w:rPr>
-        <w:t>~ .</w:t>
-      </w:r>
-      <w:proofErr w:type="gramEnd"/>
-      <w:r>
-        <w:rPr>
-          <w:rFonts w:ascii="Consolas" w:hAnsi="Consolas" w:cs="Consolas"/>
-          <w:color w:val="275317" w:themeColor="accent6" w:themeShade="80"/>
-          <w:sz w:val="16"/>
-          <w:szCs w:val="16"/>
-        </w:rPr>
-        <w:t xml:space="preserve">,          </w:t>
-      </w:r>
-    </w:p>
-    <w:p>
-      <w:pPr>
-        <w:spacing w:line="240" w:lineRule="auto"/>
-        <w:rPr>
-          <w:rFonts w:ascii="Consolas" w:hAnsi="Consolas" w:cs="Consolas"/>
-          <w:color w:val="275317" w:themeColor="accent6" w:themeShade="80"/>
-          <w:sz w:val="16"/>
-          <w:szCs w:val="16"/>
-        </w:rPr>
-      </w:pPr>
-      <w:r>
-        <w:rPr>
-          <w:rFonts w:ascii="Consolas" w:hAnsi="Consolas" w:cs="Consolas"/>
-          <w:color w:val="275317" w:themeColor="accent6" w:themeShade="80"/>
-          <w:sz w:val="16"/>
-          <w:szCs w:val="16"/>
-        </w:rPr>
-        <w:t xml:space="preserve">  data = </w:t>
-      </w:r>
-      <w:proofErr w:type="spellStart"/>
-      <w:r>
-        <w:rPr>
-          <w:rFonts w:ascii="Consolas" w:hAnsi="Consolas" w:cs="Consolas"/>
-          <w:color w:val="275317" w:themeColor="accent6" w:themeShade="80"/>
-          <w:sz w:val="16"/>
-          <w:szCs w:val="16"/>
-        </w:rPr>
-        <w:t>train_df</w:t>
-      </w:r>
-      <w:proofErr w:type="spellEnd"/>
-      <w:r>
-        <w:rPr>
-          <w:rFonts w:ascii="Consolas" w:hAnsi="Consolas" w:cs="Consolas"/>
-          <w:color w:val="275317" w:themeColor="accent6" w:themeShade="80"/>
-          <w:sz w:val="16"/>
-          <w:szCs w:val="16"/>
-        </w:rPr>
-        <w:t>,</w:t>
-      </w:r>
-    </w:p>
-    <w:p>
-      <w:pPr>
-        <w:spacing w:line="240" w:lineRule="auto"/>
-        <w:rPr>
-          <w:rFonts w:ascii="Consolas" w:hAnsi="Consolas" w:cs="Consolas"/>
-          <w:color w:val="275317" w:themeColor="accent6" w:themeShade="80"/>
-          <w:sz w:val="16"/>
-          <w:szCs w:val="16"/>
-        </w:rPr>
-      </w:pPr>
-      <w:r>
-        <w:rPr>
-          <w:rFonts w:ascii="Consolas" w:hAnsi="Consolas" w:cs="Consolas"/>
-          <w:color w:val="275317" w:themeColor="accent6" w:themeShade="80"/>
-          <w:sz w:val="16"/>
-          <w:szCs w:val="16"/>
-        </w:rPr>
-        <w:t xml:space="preserve">  family = </w:t>
-      </w:r>
-      <w:proofErr w:type="gramStart"/>
-      <w:r>
-        <w:rPr>
-          <w:rFonts w:ascii="Consolas" w:hAnsi="Consolas" w:cs="Consolas"/>
-          <w:color w:val="275317" w:themeColor="accent6" w:themeShade="80"/>
-          <w:sz w:val="16"/>
-          <w:szCs w:val="16"/>
-        </w:rPr>
-        <w:t>binomial(</w:t>
-      </w:r>
-      <w:proofErr w:type="gramEnd"/>
-      <w:r>
-        <w:rPr>
-          <w:rFonts w:ascii="Consolas" w:hAnsi="Consolas" w:cs="Consolas"/>
-          <w:color w:val="275317" w:themeColor="accent6" w:themeShade="80"/>
-          <w:sz w:val="16"/>
-          <w:szCs w:val="16"/>
-        </w:rPr>
-        <w:t xml:space="preserve">link = "logit"), </w:t>
-      </w:r>
-    </w:p>
-    <w:p>
-      <w:pPr>
-        <w:spacing w:line="240" w:lineRule="auto"/>
-        <w:rPr>
-          <w:rFonts w:ascii="Consolas" w:hAnsi="Consolas" w:cs="Consolas"/>
-          <w:color w:val="275317" w:themeColor="accent6" w:themeShade="80"/>
-          <w:sz w:val="16"/>
-          <w:szCs w:val="16"/>
-        </w:rPr>
-      </w:pPr>
-      <w:r>
-        <w:rPr>
-          <w:rFonts w:ascii="Consolas" w:hAnsi="Consolas" w:cs="Consolas"/>
-          <w:color w:val="275317" w:themeColor="accent6" w:themeShade="80"/>
-          <w:sz w:val="16"/>
-          <w:szCs w:val="16"/>
-        </w:rPr>
-        <w:t xml:space="preserve">  prior = </w:t>
-      </w:r>
-      <w:proofErr w:type="gramStart"/>
-      <w:r>
-        <w:rPr>
-          <w:rFonts w:ascii="Consolas" w:hAnsi="Consolas" w:cs="Consolas"/>
-          <w:color w:val="275317" w:themeColor="accent6" w:themeShade="80"/>
-          <w:sz w:val="16"/>
-          <w:szCs w:val="16"/>
-        </w:rPr>
-        <w:t>normal(</w:t>
-      </w:r>
-      <w:proofErr w:type="gramEnd"/>
-      <w:r>
-        <w:rPr>
-          <w:rFonts w:ascii="Consolas" w:hAnsi="Consolas" w:cs="Consolas"/>
-          <w:color w:val="275317" w:themeColor="accent6" w:themeShade="80"/>
-          <w:sz w:val="16"/>
-          <w:szCs w:val="16"/>
-        </w:rPr>
-        <w:t xml:space="preserve">0, 2.5),          </w:t>
-      </w:r>
-    </w:p>
-    <w:p>
-      <w:pPr>
-        <w:spacing w:line="240" w:lineRule="auto"/>
-        <w:rPr>
-          <w:rFonts w:ascii="Consolas" w:hAnsi="Consolas" w:cs="Consolas"/>
-          <w:color w:val="275317" w:themeColor="accent6" w:themeShade="80"/>
-          <w:sz w:val="16"/>
-          <w:szCs w:val="16"/>
-        </w:rPr>
-      </w:pPr>
-      <w:r>
-        <w:rPr>
-          <w:rFonts w:ascii="Consolas" w:hAnsi="Consolas" w:cs="Consolas"/>
-          <w:color w:val="275317" w:themeColor="accent6" w:themeShade="80"/>
-          <w:sz w:val="16"/>
-          <w:szCs w:val="16"/>
-        </w:rPr>
-        <w:t xml:space="preserve">  </w:t>
-      </w:r>
-      <w:proofErr w:type="spellStart"/>
-      <w:r>
-        <w:rPr>
-          <w:rFonts w:ascii="Consolas" w:hAnsi="Consolas" w:cs="Consolas"/>
-          <w:color w:val="275317" w:themeColor="accent6" w:themeShade="80"/>
-          <w:sz w:val="16"/>
-          <w:szCs w:val="16"/>
-        </w:rPr>
-        <w:t>prior_intercept</w:t>
-      </w:r>
-      <w:proofErr w:type="spellEnd"/>
-      <w:r>
-        <w:rPr>
-          <w:rFonts w:ascii="Consolas" w:hAnsi="Consolas" w:cs="Consolas"/>
-          <w:color w:val="275317" w:themeColor="accent6" w:themeShade="80"/>
-          <w:sz w:val="16"/>
-          <w:szCs w:val="16"/>
-        </w:rPr>
-        <w:t xml:space="preserve"> = </w:t>
-      </w:r>
-      <w:proofErr w:type="gramStart"/>
-      <w:r>
-        <w:rPr>
-          <w:rFonts w:ascii="Consolas" w:hAnsi="Consolas" w:cs="Consolas"/>
-          <w:color w:val="275317" w:themeColor="accent6" w:themeShade="80"/>
-          <w:sz w:val="16"/>
-          <w:szCs w:val="16"/>
-        </w:rPr>
-        <w:t>normal(</w:t>
-      </w:r>
-      <w:proofErr w:type="gramEnd"/>
-      <w:r>
-        <w:rPr>
-          <w:rFonts w:ascii="Consolas" w:hAnsi="Consolas" w:cs="Consolas"/>
-          <w:color w:val="275317" w:themeColor="accent6" w:themeShade="80"/>
-          <w:sz w:val="16"/>
-          <w:szCs w:val="16"/>
-        </w:rPr>
-        <w:t xml:space="preserve">0, 10),   </w:t>
-      </w:r>
-    </w:p>
-    <w:p>
-      <w:pPr>
-        <w:spacing w:line="240" w:lineRule="auto"/>
-        <w:rPr>
-          <w:rFonts w:ascii="Consolas" w:hAnsi="Consolas" w:cs="Consolas"/>
-          <w:color w:val="275317" w:themeColor="accent6" w:themeShade="80"/>
-          <w:sz w:val="16"/>
-          <w:szCs w:val="16"/>
-        </w:rPr>
-      </w:pPr>
-      <w:r>
-        <w:rPr>
-          <w:rFonts w:ascii="Consolas" w:hAnsi="Consolas" w:cs="Consolas"/>
-          <w:color w:val="275317" w:themeColor="accent6" w:themeShade="80"/>
-          <w:sz w:val="16"/>
-          <w:szCs w:val="16"/>
-        </w:rPr>
-        <w:t xml:space="preserve">  chains = 4,              </w:t>
-      </w:r>
-    </w:p>
-    <w:p>
-      <w:pPr>
-        <w:spacing w:line="240" w:lineRule="auto"/>
-        <w:rPr>
-          <w:rFonts w:ascii="Consolas" w:hAnsi="Consolas" w:cs="Consolas"/>
-          <w:color w:val="275317" w:themeColor="accent6" w:themeShade="80"/>
-          <w:sz w:val="16"/>
-          <w:szCs w:val="16"/>
-        </w:rPr>
-      </w:pPr>
-      <w:r>
-        <w:rPr>
-          <w:rFonts w:ascii="Consolas" w:hAnsi="Consolas" w:cs="Consolas"/>
-          <w:color w:val="275317" w:themeColor="accent6" w:themeShade="80"/>
-          <w:sz w:val="16"/>
-          <w:szCs w:val="16"/>
-        </w:rPr>
-        <w:t xml:space="preserve">  </w:t>
-      </w:r>
-      <w:proofErr w:type="spellStart"/>
-      <w:r>
-        <w:rPr>
-          <w:rFonts w:ascii="Consolas" w:hAnsi="Consolas" w:cs="Consolas"/>
-          <w:color w:val="275317" w:themeColor="accent6" w:themeShade="80"/>
-          <w:sz w:val="16"/>
-          <w:szCs w:val="16"/>
-        </w:rPr>
-        <w:t>iter</w:t>
-      </w:r>
-      <w:proofErr w:type="spellEnd"/>
-      <w:r>
-        <w:rPr>
-          <w:rFonts w:ascii="Consolas" w:hAnsi="Consolas" w:cs="Consolas"/>
-          <w:color w:val="275317" w:themeColor="accent6" w:themeShade="80"/>
-          <w:sz w:val="16"/>
-          <w:szCs w:val="16"/>
-        </w:rPr>
-        <w:t xml:space="preserve"> = 1000,        </w:t>
-      </w:r>
-    </w:p>
-    <w:p>
-      <w:pPr>
-        <w:spacing w:line="240" w:lineRule="auto"/>
-        <w:rPr>
-          <w:rFonts w:ascii="Consolas" w:hAnsi="Consolas" w:cs="Consolas"/>
-          <w:color w:val="275317" w:themeColor="accent6" w:themeShade="80"/>
-          <w:sz w:val="16"/>
-          <w:szCs w:val="16"/>
-        </w:rPr>
-      </w:pPr>
-      <w:r>
-        <w:rPr>
-          <w:rFonts w:ascii="Consolas" w:hAnsi="Consolas" w:cs="Consolas"/>
-          <w:color w:val="275317" w:themeColor="accent6" w:themeShade="80"/>
-          <w:sz w:val="16"/>
-          <w:szCs w:val="16"/>
-        </w:rPr>
-        <w:t xml:space="preserve">  warmup = 500,          </w:t>
-      </w:r>
-    </w:p>
-    <w:p>
-      <w:pPr>
-        <w:spacing w:line="240" w:lineRule="auto"/>
-        <w:rPr>
-          <w:rFonts w:ascii="Consolas" w:hAnsi="Consolas" w:cs="Consolas"/>
-          <w:color w:val="275317" w:themeColor="accent6" w:themeShade="80"/>
-          <w:sz w:val="16"/>
-          <w:szCs w:val="16"/>
-        </w:rPr>
-      </w:pPr>
-      <w:r>
-        <w:rPr>
-          <w:rFonts w:ascii="Consolas" w:hAnsi="Consolas" w:cs="Consolas"/>
-          <w:color w:val="275317" w:themeColor="accent6" w:themeShade="80"/>
-          <w:sz w:val="16"/>
-          <w:szCs w:val="16"/>
-        </w:rPr>
-        <w:t xml:space="preserve">  cores = 4,            </w:t>
-      </w:r>
-    </w:p>
-    <w:p>
-      <w:pPr>
-        <w:spacing w:line="240" w:lineRule="auto"/>
-        <w:rPr>
-          <w:rFonts w:ascii="Consolas" w:hAnsi="Consolas" w:cs="Consolas"/>
-          <w:color w:val="275317" w:themeColor="accent6" w:themeShade="80"/>
-          <w:sz w:val="16"/>
-          <w:szCs w:val="16"/>
-        </w:rPr>
-      </w:pPr>
-      <w:r>
-        <w:rPr>
-          <w:rFonts w:ascii="Consolas" w:hAnsi="Consolas" w:cs="Consolas"/>
-          <w:color w:val="275317" w:themeColor="accent6" w:themeShade="80"/>
-          <w:sz w:val="16"/>
-          <w:szCs w:val="16"/>
-        </w:rPr>
-        <w:t xml:space="preserve">  seed = 33,</w:t>
-      </w:r>
-    </w:p>
-    <w:p>
-      <w:pPr>
-        <w:spacing w:line="240" w:lineRule="auto"/>
-        <w:rPr>
-          <w:rFonts w:ascii="Consolas" w:hAnsi="Consolas" w:cs="Consolas"/>
-          <w:color w:val="275317" w:themeColor="accent6" w:themeShade="80"/>
-          <w:sz w:val="16"/>
-          <w:szCs w:val="16"/>
-        </w:rPr>
-      </w:pPr>
-      <w:r>
-        <w:rPr>
-          <w:rFonts w:ascii="Consolas" w:hAnsi="Consolas" w:cs="Consolas"/>
-          <w:color w:val="275317" w:themeColor="accent6" w:themeShade="80"/>
-          <w:sz w:val="16"/>
-          <w:szCs w:val="16"/>
-        </w:rPr>
-        <w:t xml:space="preserve">  refresh = 200</w:t>
-      </w:r>
-    </w:p>
-    <w:p>
-      <w:pPr>
-        <w:spacing w:line="240" w:lineRule="auto"/>
-        <w:rPr>
-          <w:rFonts w:ascii="Consolas" w:hAnsi="Consolas" w:cs="Consolas"/>
-          <w:color w:val="275317" w:themeColor="accent6" w:themeShade="80"/>
-          <w:sz w:val="16"/>
-          <w:szCs w:val="16"/>
-        </w:rPr>
-      </w:pPr>
-      <w:r>
-        <w:rPr>
-          <w:rFonts w:ascii="Consolas" w:hAnsi="Consolas" w:cs="Consolas"/>
-          <w:color w:val="275317" w:themeColor="accent6" w:themeShade="80"/>
-          <w:sz w:val="16"/>
-          <w:szCs w:val="16"/>
-        </w:rPr>
-        <w:t>)</w:t>
-      </w:r>
+          <w:rFonts w:ascii="Consolas" w:hAnsi="Consolas" w:cs="Consolas"/>
+          <w:sz w:val="16"/>
+          <w:szCs w:val="16"/>
+        </w:rPr>
+      </w:pPr>
     </w:p>
     <w:sectPr>
       <w:pgSz w:w="11906" w:h="16838"/>
@@ -5934,18 +5680,18 @@
     <w:lsdException w:name="Unresolved Mention" w:semiHidden="1" w:unhideWhenUsed="1"/>
     <w:lsdException w:name="Smart Link" w:semiHidden="1" w:unhideWhenUsed="1"/>
   </w:latentStyles>
-  <w:style w:type="paragraph" w:default="1" w:styleId="Normal">
+  <w:style w:type="paragraph" w:default="1" w:styleId="a">
     <w:name w:val="Normal"/>
     <w:qFormat/>
     <w:pPr>
       <w:widowControl w:val="0"/>
     </w:pPr>
   </w:style>
-  <w:style w:type="paragraph" w:styleId="Heading1">
+  <w:style w:type="paragraph" w:styleId="1">
     <w:name w:val="heading 1"/>
-    <w:basedOn w:val="Normal"/>
-    <w:next w:val="Normal"/>
-    <w:link w:val="Heading1Char"/>
+    <w:basedOn w:val="a"/>
+    <w:next w:val="a"/>
+    <w:link w:val="10"/>
     <w:uiPriority w:val="9"/>
     <w:qFormat/>
     <w:rsid w:val="00005A1C"/>
@@ -5962,11 +5708,11 @@
       <w:szCs w:val="48"/>
     </w:rPr>
   </w:style>
-  <w:style w:type="paragraph" w:styleId="Heading2">
+  <w:style w:type="paragraph" w:styleId="2">
     <w:name w:val="heading 2"/>
-    <w:basedOn w:val="Normal"/>
-    <w:next w:val="Normal"/>
-    <w:link w:val="Heading2Char"/>
+    <w:basedOn w:val="a"/>
+    <w:next w:val="a"/>
+    <w:link w:val="20"/>
     <w:uiPriority w:val="9"/>
     <w:semiHidden/>
     <w:unhideWhenUsed/>
@@ -5985,11 +5731,11 @@
       <w:szCs w:val="40"/>
     </w:rPr>
   </w:style>
-  <w:style w:type="paragraph" w:styleId="Heading3">
+  <w:style w:type="paragraph" w:styleId="3">
     <w:name w:val="heading 3"/>
-    <w:basedOn w:val="Normal"/>
-    <w:next w:val="Normal"/>
-    <w:link w:val="Heading3Char"/>
+    <w:basedOn w:val="a"/>
+    <w:next w:val="a"/>
+    <w:link w:val="30"/>
     <w:uiPriority w:val="9"/>
     <w:semiHidden/>
     <w:unhideWhenUsed/>
@@ -6008,11 +5754,11 @@
       <w:szCs w:val="32"/>
     </w:rPr>
   </w:style>
-  <w:style w:type="paragraph" w:styleId="Heading4">
+  <w:style w:type="paragraph" w:styleId="4">
     <w:name w:val="heading 4"/>
-    <w:basedOn w:val="Normal"/>
-    <w:next w:val="Normal"/>
-    <w:link w:val="Heading4Char"/>
+    <w:basedOn w:val="a"/>
+    <w:next w:val="a"/>
+    <w:link w:val="40"/>
     <w:uiPriority w:val="9"/>
     <w:semiHidden/>
     <w:unhideWhenUsed/>
@@ -6031,11 +5777,11 @@
       <w:szCs w:val="28"/>
     </w:rPr>
   </w:style>
-  <w:style w:type="paragraph" w:styleId="Heading5">
+  <w:style w:type="paragraph" w:styleId="5">
     <w:name w:val="heading 5"/>
-    <w:basedOn w:val="Normal"/>
-    <w:next w:val="Normal"/>
-    <w:link w:val="Heading5Char"/>
+    <w:basedOn w:val="a"/>
+    <w:next w:val="a"/>
+    <w:link w:val="50"/>
     <w:uiPriority w:val="9"/>
     <w:semiHidden/>
     <w:unhideWhenUsed/>
@@ -6053,11 +5799,11 @@
       <w:sz w:val="24"/>
     </w:rPr>
   </w:style>
-  <w:style w:type="paragraph" w:styleId="Heading6">
+  <w:style w:type="paragraph" w:styleId="6">
     <w:name w:val="heading 6"/>
-    <w:basedOn w:val="Normal"/>
-    <w:next w:val="Normal"/>
-    <w:link w:val="Heading6Char"/>
+    <w:basedOn w:val="a"/>
+    <w:next w:val="a"/>
+    <w:link w:val="60"/>
     <w:uiPriority w:val="9"/>
     <w:semiHidden/>
     <w:unhideWhenUsed/>
@@ -6076,11 +5822,11 @@
       <w:color w:val="0F4761" w:themeColor="accent1" w:themeShade="BF"/>
     </w:rPr>
   </w:style>
-  <w:style w:type="paragraph" w:styleId="Heading7">
+  <w:style w:type="paragraph" w:styleId="7">
     <w:name w:val="heading 7"/>
-    <w:basedOn w:val="Normal"/>
-    <w:next w:val="Normal"/>
-    <w:link w:val="Heading7Char"/>
+    <w:basedOn w:val="a"/>
+    <w:next w:val="a"/>
+    <w:link w:val="70"/>
     <w:uiPriority w:val="9"/>
     <w:semiHidden/>
     <w:unhideWhenUsed/>
@@ -6099,11 +5845,11 @@
       <w:color w:val="595959" w:themeColor="text1" w:themeTint="A6"/>
     </w:rPr>
   </w:style>
-  <w:style w:type="paragraph" w:styleId="Heading8">
+  <w:style w:type="paragraph" w:styleId="8">
     <w:name w:val="heading 8"/>
-    <w:basedOn w:val="Normal"/>
-    <w:next w:val="Normal"/>
-    <w:link w:val="Heading8Char"/>
+    <w:basedOn w:val="a"/>
+    <w:next w:val="a"/>
+    <w:link w:val="80"/>
     <w:uiPriority w:val="9"/>
     <w:semiHidden/>
     <w:unhideWhenUsed/>
@@ -6120,11 +5866,11 @@
       <w:color w:val="595959" w:themeColor="text1" w:themeTint="A6"/>
     </w:rPr>
   </w:style>
-  <w:style w:type="paragraph" w:styleId="Heading9">
+  <w:style w:type="paragraph" w:styleId="9">
     <w:name w:val="heading 9"/>
-    <w:basedOn w:val="Normal"/>
-    <w:next w:val="Normal"/>
-    <w:link w:val="Heading9Char"/>
+    <w:basedOn w:val="a"/>
+    <w:next w:val="a"/>
+    <w:link w:val="90"/>
     <w:uiPriority w:val="9"/>
     <w:semiHidden/>
     <w:unhideWhenUsed/>
@@ -6141,13 +5887,13 @@
       <w:color w:val="595959" w:themeColor="text1" w:themeTint="A6"/>
     </w:rPr>
   </w:style>
-  <w:style w:type="character" w:default="1" w:styleId="DefaultParagraphFont">
+  <w:style w:type="character" w:default="1" w:styleId="a0">
     <w:name w:val="Default Paragraph Font"/>
     <w:uiPriority w:val="1"/>
     <w:semiHidden/>
     <w:unhideWhenUsed/>
   </w:style>
-  <w:style w:type="table" w:default="1" w:styleId="TableNormal">
+  <w:style w:type="table" w:default="1" w:styleId="a1">
     <w:name w:val="Normal Table"/>
     <w:uiPriority w:val="99"/>
     <w:semiHidden/>
@@ -6162,16 +5908,16 @@
       </w:tblCellMar>
     </w:tblPr>
   </w:style>
-  <w:style w:type="numbering" w:default="1" w:styleId="NoList">
+  <w:style w:type="numbering" w:default="1" w:styleId="a2">
     <w:name w:val="No List"/>
     <w:uiPriority w:val="99"/>
     <w:semiHidden/>
     <w:unhideWhenUsed/>
   </w:style>
-  <w:style w:type="character" w:customStyle="1" w:styleId="Heading1Char">
-    <w:name w:val="Heading 1 Char"/>
-    <w:basedOn w:val="DefaultParagraphFont"/>
-    <w:link w:val="Heading1"/>
+  <w:style w:type="character" w:customStyle="1" w:styleId="10">
+    <w:name w:val="标题 1 字符"/>
+    <w:basedOn w:val="a0"/>
+    <w:link w:val="1"/>
     <w:uiPriority w:val="9"/>
     <w:rsid w:val="00005A1C"/>
     <w:rPr>
@@ -6181,10 +5927,10 @@
       <w:szCs w:val="48"/>
     </w:rPr>
   </w:style>
-  <w:style w:type="character" w:customStyle="1" w:styleId="Heading2Char">
-    <w:name w:val="Heading 2 Char"/>
-    <w:basedOn w:val="DefaultParagraphFont"/>
-    <w:link w:val="Heading2"/>
+  <w:style w:type="character" w:customStyle="1" w:styleId="20">
+    <w:name w:val="标题 2 字符"/>
+    <w:basedOn w:val="a0"/>
+    <w:link w:val="2"/>
     <w:uiPriority w:val="9"/>
     <w:semiHidden/>
     <w:rsid w:val="00005A1C"/>
@@ -6195,10 +5941,10 @@
       <w:szCs w:val="40"/>
     </w:rPr>
   </w:style>
-  <w:style w:type="character" w:customStyle="1" w:styleId="Heading3Char">
-    <w:name w:val="Heading 3 Char"/>
-    <w:basedOn w:val="DefaultParagraphFont"/>
-    <w:link w:val="Heading3"/>
+  <w:style w:type="character" w:customStyle="1" w:styleId="30">
+    <w:name w:val="标题 3 字符"/>
+    <w:basedOn w:val="a0"/>
+    <w:link w:val="3"/>
     <w:uiPriority w:val="9"/>
     <w:semiHidden/>
     <w:rsid w:val="00005A1C"/>
@@ -6209,10 +5955,10 @@
       <w:szCs w:val="32"/>
     </w:rPr>
   </w:style>
-  <w:style w:type="character" w:customStyle="1" w:styleId="Heading4Char">
-    <w:name w:val="Heading 4 Char"/>
-    <w:basedOn w:val="DefaultParagraphFont"/>
-    <w:link w:val="Heading4"/>
+  <w:style w:type="character" w:customStyle="1" w:styleId="40">
+    <w:name w:val="标题 4 字符"/>
+    <w:basedOn w:val="a0"/>
+    <w:link w:val="4"/>
     <w:uiPriority w:val="9"/>
     <w:semiHidden/>
     <w:rsid w:val="00005A1C"/>
@@ -6223,10 +5969,10 @@
       <w:szCs w:val="28"/>
     </w:rPr>
   </w:style>
-  <w:style w:type="character" w:customStyle="1" w:styleId="Heading5Char">
-    <w:name w:val="Heading 5 Char"/>
-    <w:basedOn w:val="DefaultParagraphFont"/>
-    <w:link w:val="Heading5"/>
+  <w:style w:type="character" w:customStyle="1" w:styleId="50">
+    <w:name w:val="标题 5 字符"/>
+    <w:basedOn w:val="a0"/>
+    <w:link w:val="5"/>
     <w:uiPriority w:val="9"/>
     <w:semiHidden/>
     <w:rsid w:val="00005A1C"/>
@@ -6236,10 +5982,10 @@
       <w:sz w:val="24"/>
     </w:rPr>
   </w:style>
-  <w:style w:type="character" w:customStyle="1" w:styleId="Heading6Char">
-    <w:name w:val="Heading 6 Char"/>
-    <w:basedOn w:val="DefaultParagraphFont"/>
-    <w:link w:val="Heading6"/>
+  <w:style w:type="character" w:customStyle="1" w:styleId="60">
+    <w:name w:val="标题 6 字符"/>
+    <w:basedOn w:val="a0"/>
+    <w:link w:val="6"/>
     <w:uiPriority w:val="9"/>
     <w:semiHidden/>
     <w:rsid w:val="00005A1C"/>
@@ -6250,10 +5996,10 @@
       <w:color w:val="0F4761" w:themeColor="accent1" w:themeShade="BF"/>
     </w:rPr>
   </w:style>
-  <w:style w:type="character" w:customStyle="1" w:styleId="Heading7Char">
-    <w:name w:val="Heading 7 Char"/>
-    <w:basedOn w:val="DefaultParagraphFont"/>
-    <w:link w:val="Heading7"/>
+  <w:style w:type="character" w:customStyle="1" w:styleId="70">
+    <w:name w:val="标题 7 字符"/>
+    <w:basedOn w:val="a0"/>
+    <w:link w:val="7"/>
     <w:uiPriority w:val="9"/>
     <w:semiHidden/>
     <w:rsid w:val="00005A1C"/>
@@ -6264,10 +6010,10 @@
       <w:color w:val="595959" w:themeColor="text1" w:themeTint="A6"/>
     </w:rPr>
   </w:style>
-  <w:style w:type="character" w:customStyle="1" w:styleId="Heading8Char">
-    <w:name w:val="Heading 8 Char"/>
-    <w:basedOn w:val="DefaultParagraphFont"/>
-    <w:link w:val="Heading8"/>
+  <w:style w:type="character" w:customStyle="1" w:styleId="80">
+    <w:name w:val="标题 8 字符"/>
+    <w:basedOn w:val="a0"/>
+    <w:link w:val="8"/>
     <w:uiPriority w:val="9"/>
     <w:semiHidden/>
     <w:rsid w:val="00005A1C"/>
@@ -6276,10 +6022,10 @@
       <w:color w:val="595959" w:themeColor="text1" w:themeTint="A6"/>
     </w:rPr>
   </w:style>
-  <w:style w:type="character" w:customStyle="1" w:styleId="Heading9Char">
-    <w:name w:val="Heading 9 Char"/>
-    <w:basedOn w:val="DefaultParagraphFont"/>
-    <w:link w:val="Heading9"/>
+  <w:style w:type="character" w:customStyle="1" w:styleId="90">
+    <w:name w:val="标题 9 字符"/>
+    <w:basedOn w:val="a0"/>
+    <w:link w:val="9"/>
     <w:uiPriority w:val="9"/>
     <w:semiHidden/>
     <w:rsid w:val="00005A1C"/>
@@ -6288,11 +6034,11 @@
       <w:color w:val="595959" w:themeColor="text1" w:themeTint="A6"/>
     </w:rPr>
   </w:style>
-  <w:style w:type="paragraph" w:styleId="Title">
+  <w:style w:type="paragraph" w:styleId="a3">
     <w:name w:val="Title"/>
-    <w:basedOn w:val="Normal"/>
-    <w:next w:val="Normal"/>
-    <w:link w:val="TitleChar"/>
+    <w:basedOn w:val="a"/>
+    <w:next w:val="a"/>
+    <w:link w:val="a4"/>
     <w:uiPriority w:val="10"/>
     <w:qFormat/>
     <w:rsid w:val="00005A1C"/>
@@ -6309,10 +6055,10 @@
       <w:szCs w:val="56"/>
     </w:rPr>
   </w:style>
-  <w:style w:type="character" w:customStyle="1" w:styleId="TitleChar">
-    <w:name w:val="Title Char"/>
-    <w:basedOn w:val="DefaultParagraphFont"/>
-    <w:link w:val="Title"/>
+  <w:style w:type="character" w:customStyle="1" w:styleId="a4">
+    <w:name w:val="标题 字符"/>
+    <w:basedOn w:val="a0"/>
+    <w:link w:val="a3"/>
     <w:uiPriority w:val="10"/>
     <w:rsid w:val="00005A1C"/>
     <w:rPr>
@@ -6323,11 +6069,11 @@
       <w:szCs w:val="56"/>
     </w:rPr>
   </w:style>
-  <w:style w:type="paragraph" w:styleId="Subtitle">
+  <w:style w:type="paragraph" w:styleId="a5">
     <w:name w:val="Subtitle"/>
-    <w:basedOn w:val="Normal"/>
-    <w:next w:val="Normal"/>
-    <w:link w:val="SubtitleChar"/>
+    <w:basedOn w:val="a"/>
+    <w:next w:val="a"/>
+    <w:link w:val="a6"/>
     <w:uiPriority w:val="11"/>
     <w:qFormat/>
     <w:rsid w:val="00005A1C"/>
@@ -6345,10 +6091,10 @@
       <w:szCs w:val="28"/>
     </w:rPr>
   </w:style>
-  <w:style w:type="character" w:customStyle="1" w:styleId="SubtitleChar">
-    <w:name w:val="Subtitle Char"/>
-    <w:basedOn w:val="DefaultParagraphFont"/>
-    <w:link w:val="Subtitle"/>
+  <w:style w:type="character" w:customStyle="1" w:styleId="a6">
+    <w:name w:val="副标题 字符"/>
+    <w:basedOn w:val="a0"/>
+    <w:link w:val="a5"/>
     <w:uiPriority w:val="11"/>
     <w:rsid w:val="00005A1C"/>
     <w:rPr>
@@ -6359,11 +6105,11 @@
       <w:szCs w:val="28"/>
     </w:rPr>
   </w:style>
-  <w:style w:type="paragraph" w:styleId="Quote">
+  <w:style w:type="paragraph" w:styleId="a7">
     <w:name w:val="Quote"/>
-    <w:basedOn w:val="Normal"/>
-    <w:next w:val="Normal"/>
-    <w:link w:val="QuoteChar"/>
+    <w:basedOn w:val="a"/>
+    <w:next w:val="a"/>
+    <w:link w:val="a8"/>
     <w:uiPriority w:val="29"/>
     <w:qFormat/>
     <w:rsid w:val="00005A1C"/>
@@ -6377,10 +6123,10 @@
       <w:color w:val="404040" w:themeColor="text1" w:themeTint="BF"/>
     </w:rPr>
   </w:style>
-  <w:style w:type="character" w:customStyle="1" w:styleId="QuoteChar">
-    <w:name w:val="Quote Char"/>
-    <w:basedOn w:val="DefaultParagraphFont"/>
-    <w:link w:val="Quote"/>
+  <w:style w:type="character" w:customStyle="1" w:styleId="a8">
+    <w:name w:val="引用 字符"/>
+    <w:basedOn w:val="a0"/>
+    <w:link w:val="a7"/>
     <w:uiPriority w:val="29"/>
     <w:rsid w:val="00005A1C"/>
     <w:rPr>
@@ -6389,9 +6135,9 @@
       <w:color w:val="404040" w:themeColor="text1" w:themeTint="BF"/>
     </w:rPr>
   </w:style>
-  <w:style w:type="paragraph" w:styleId="ListParagraph">
+  <w:style w:type="paragraph" w:styleId="a9">
     <w:name w:val="List Paragraph"/>
-    <w:basedOn w:val="Normal"/>
+    <w:basedOn w:val="a"/>
     <w:uiPriority w:val="34"/>
     <w:qFormat/>
     <w:rsid w:val="00005A1C"/>
@@ -6400,9 +6146,9 @@
       <w:contextualSpacing/>
     </w:pPr>
   </w:style>
-  <w:style w:type="character" w:styleId="IntenseEmphasis">
+  <w:style w:type="character" w:styleId="aa">
     <w:name w:val="Intense Emphasis"/>
-    <w:basedOn w:val="DefaultParagraphFont"/>
+    <w:basedOn w:val="a0"/>
     <w:uiPriority w:val="21"/>
     <w:qFormat/>
     <w:rsid w:val="00005A1C"/>
@@ -6412,11 +6158,11 @@
       <w:color w:val="0F4761" w:themeColor="accent1" w:themeShade="BF"/>
     </w:rPr>
   </w:style>
-  <w:style w:type="paragraph" w:styleId="IntenseQuote">
+  <w:style w:type="paragraph" w:styleId="ab">
     <w:name w:val="Intense Quote"/>
-    <w:basedOn w:val="Normal"/>
-    <w:next w:val="Normal"/>
-    <w:link w:val="IntenseQuoteChar"/>
+    <w:basedOn w:val="a"/>
+    <w:next w:val="a"/>
+    <w:link w:val="ac"/>
     <w:uiPriority w:val="30"/>
     <w:qFormat/>
     <w:rsid w:val="00005A1C"/>
@@ -6435,10 +6181,10 @@
       <w:color w:val="0F4761" w:themeColor="accent1" w:themeShade="BF"/>
     </w:rPr>
   </w:style>
-  <w:style w:type="character" w:customStyle="1" w:styleId="IntenseQuoteChar">
-    <w:name w:val="Intense Quote Char"/>
-    <w:basedOn w:val="DefaultParagraphFont"/>
-    <w:link w:val="IntenseQuote"/>
+  <w:style w:type="character" w:customStyle="1" w:styleId="ac">
+    <w:name w:val="明显引用 字符"/>
+    <w:basedOn w:val="a0"/>
+    <w:link w:val="ab"/>
     <w:uiPriority w:val="30"/>
     <w:rsid w:val="00005A1C"/>
     <w:rPr>
@@ -6447,9 +6193,9 @@
       <w:color w:val="0F4761" w:themeColor="accent1" w:themeShade="BF"/>
     </w:rPr>
   </w:style>
-  <w:style w:type="character" w:styleId="IntenseReference">
+  <w:style w:type="character" w:styleId="ad">
     <w:name w:val="Intense Reference"/>
-    <w:basedOn w:val="DefaultParagraphFont"/>
+    <w:basedOn w:val="a0"/>
     <w:uiPriority w:val="32"/>
     <w:qFormat/>
     <w:rsid w:val="00005A1C"/>
@@ -6461,9 +6207,9 @@
       <w:spacing w:val="5"/>
     </w:rPr>
   </w:style>
-  <w:style w:type="character" w:styleId="PlaceholderText">
+  <w:style w:type="character" w:styleId="ae">
     <w:name w:val="Placeholder Text"/>
-    <w:basedOn w:val="DefaultParagraphFont"/>
+    <w:basedOn w:val="a0"/>
     <w:uiPriority w:val="99"/>
     <w:semiHidden/>
     <w:rsid w:val="002D3C05"/>
@@ -6473,7 +6219,7 @@
   </w:style>
   <w:style w:type="paragraph" w:customStyle="1" w:styleId="font-claude-response-body">
     <w:name w:val="font-claude-response-body"/>
-    <w:basedOn w:val="Normal"/>
+    <w:basedOn w:val="a"/>
     <w:rsid w:val="00F26A61"/>
     <w:pPr>
       <w:widowControl/>
@@ -6486,9 +6232,9 @@
       <w14:ligatures w14:val="none"/>
     </w:rPr>
   </w:style>
-  <w:style w:type="character" w:styleId="Strong">
+  <w:style w:type="character" w:styleId="af">
     <w:name w:val="Strong"/>
-    <w:basedOn w:val="DefaultParagraphFont"/>
+    <w:basedOn w:val="a0"/>
     <w:uiPriority w:val="22"/>
     <w:qFormat/>
     <w:rsid w:val="00F26A61"/>
@@ -6497,9 +6243,9 @@
       <w:bCs/>
     </w:rPr>
   </w:style>
-  <w:style w:type="character" w:styleId="HTMLCode">
+  <w:style w:type="character" w:styleId="HTML">
     <w:name w:val="HTML Code"/>
-    <w:basedOn w:val="DefaultParagraphFont"/>
+    <w:basedOn w:val="a0"/>
     <w:uiPriority w:val="99"/>
     <w:semiHidden/>
     <w:unhideWhenUsed/>

</xml_diff>

<commit_message>
some more final editions
</commit_message>
<xml_diff>
--- a/final proj ds4420 report.docx
+++ b/final proj ds4420 report.docx
@@ -703,7 +703,7 @@
       </w:r>
       <w:r>
         <w:rPr>
-          <w:rStyle w:val="HTMLCode"/>
+          <w:rStyle w:val="HTML"/>
           <w:rFonts w:ascii="Times New Roman" w:eastAsiaTheme="majorEastAsia" w:hAnsi="Times New Roman" w:cs="Times New Roman"/>
           <w:sz w:val="22"/>
           <w:szCs w:val="22"/>
@@ -733,7 +733,7 @@
       </w:r>
       <w:r>
         <w:rPr>
-          <w:rStyle w:val="HTMLCode"/>
+          <w:rStyle w:val="HTML"/>
           <w:rFonts w:ascii="Times New Roman" w:eastAsiaTheme="majorEastAsia" w:hAnsi="Times New Roman" w:cs="Times New Roman"/>
           <w:sz w:val="22"/>
           <w:szCs w:val="22"/>
@@ -2270,7 +2270,7 @@
       </w:pPr>
       <w:r>
         <w:rPr>
-          <w:rStyle w:val="Strong"/>
+          <w:rStyle w:val="af"/>
           <w:rFonts w:eastAsiaTheme="majorEastAsia"/>
           <w:sz w:val="22"/>
           <w:szCs w:val="22"/>
@@ -2820,6 +2820,134 @@
           <w:b/>
           <w:bCs/>
         </w:rPr>
+        <w:t>Model Assumptions and Data Appropriateness</w:t>
+      </w:r>
+    </w:p>
+    <w:p>
+      <w:pPr>
+        <w:spacing w:line="240" w:lineRule="auto"/>
+        <w:rPr>
+          <w:rFonts w:ascii="Times New Roman" w:hAnsi="Times New Roman" w:cs="Times New Roman"/>
+        </w:rPr>
+      </w:pPr>
+      <w:r>
+        <w:rPr>
+          <w:rFonts w:ascii="Times New Roman" w:hAnsi="Times New Roman" w:cs="Times New Roman"/>
+        </w:rPr>
+        <w:t xml:space="preserve">Regarding </w:t>
+      </w:r>
+      <w:r>
+        <w:rPr>
+          <w:rFonts w:ascii="Times New Roman" w:hAnsi="Times New Roman" w:cs="Times New Roman"/>
+        </w:rPr>
+        <w:t xml:space="preserve">our </w:t>
+      </w:r>
+      <w:r>
+        <w:rPr>
+          <w:rFonts w:ascii="Times New Roman" w:hAnsi="Times New Roman" w:cs="Times New Roman"/>
+        </w:rPr>
+        <w:t xml:space="preserve">model assumptions, </w:t>
+      </w:r>
+      <w:r>
+        <w:rPr>
+          <w:rFonts w:ascii="Times New Roman" w:hAnsi="Times New Roman" w:cs="Times New Roman"/>
+        </w:rPr>
+        <w:t>BLR has</w:t>
+      </w:r>
+      <w:r>
+        <w:rPr>
+          <w:rFonts w:ascii="Times New Roman" w:hAnsi="Times New Roman" w:cs="Times New Roman"/>
+        </w:rPr>
+        <w:t xml:space="preserve"> fundamentally assumes a linear relationship between the independent variables and the log-odds of the high-risk flood designation. The fact that</w:t>
+      </w:r>
+      <w:r>
+        <w:rPr>
+          <w:rFonts w:ascii="Times New Roman" w:hAnsi="Times New Roman" w:cs="Times New Roman"/>
+        </w:rPr>
+        <w:t xml:space="preserve"> we could see is,</w:t>
+      </w:r>
+      <w:r>
+        <w:rPr>
+          <w:rFonts w:ascii="Times New Roman" w:hAnsi="Times New Roman" w:cs="Times New Roman"/>
+        </w:rPr>
+        <w:t xml:space="preserve"> the MLP outperform the BLR</w:t>
+      </w:r>
+      <w:r>
+        <w:rPr>
+          <w:rFonts w:ascii="Times New Roman" w:hAnsi="Times New Roman" w:cs="Times New Roman"/>
+        </w:rPr>
+        <w:t xml:space="preserve">, </w:t>
+      </w:r>
+      <w:r>
+        <w:rPr>
+          <w:rFonts w:ascii="Times New Roman" w:hAnsi="Times New Roman" w:cs="Times New Roman"/>
+        </w:rPr>
+        <w:t>particularly in Recall (0.9440 vs 0.7675)</w:t>
+      </w:r>
+      <w:r>
+        <w:rPr>
+          <w:rFonts w:ascii="Times New Roman" w:hAnsi="Times New Roman" w:cs="Times New Roman"/>
+        </w:rPr>
+        <w:t xml:space="preserve">, which </w:t>
+      </w:r>
+      <w:r>
+        <w:rPr>
+          <w:rFonts w:ascii="Times New Roman" w:hAnsi="Times New Roman" w:cs="Times New Roman"/>
+        </w:rPr>
+        <w:t xml:space="preserve">suggests that this linearity assumption may not perfectly hold for </w:t>
+      </w:r>
+      <w:r>
+        <w:rPr>
+          <w:rFonts w:ascii="Times New Roman" w:hAnsi="Times New Roman" w:cs="Times New Roman"/>
+        </w:rPr>
+        <w:t>our</w:t>
+      </w:r>
+      <w:r>
+        <w:rPr>
+          <w:rFonts w:ascii="Times New Roman" w:hAnsi="Times New Roman" w:cs="Times New Roman"/>
+        </w:rPr>
+        <w:t xml:space="preserve"> dataset, as true structural vulnerability is likely driven by complex, non-linear interactions among features. Additionally, BLR assumes the independence of observations; while our data represents distinct structures, some spatial autocorrelation might exist in real-world flood zones (buildings in close proximity sharing similar localized risks). Conversely, the MLP does not rely on these strict statistical assumption, ma</w:t>
+      </w:r>
+      <w:r>
+        <w:rPr>
+          <w:rFonts w:ascii="Times New Roman" w:hAnsi="Times New Roman" w:cs="Times New Roman"/>
+        </w:rPr>
+        <w:t>de</w:t>
+      </w:r>
+      <w:r>
+        <w:rPr>
+          <w:rFonts w:ascii="Times New Roman" w:hAnsi="Times New Roman" w:cs="Times New Roman"/>
+        </w:rPr>
+        <w:t xml:space="preserve"> it highly appropriate for mapping non-linear structural patterns. The primary requirement for the MLP was that the input space be properly scaled to ensure stable gradient descent convergence, which was successfully met through our standardization step and validate by the smooth convergence of training error</w:t>
+      </w:r>
+      <w:r>
+        <w:rPr>
+          <w:rFonts w:ascii="Times New Roman" w:hAnsi="Times New Roman" w:cs="Times New Roman"/>
+        </w:rPr>
+        <w:t>s</w:t>
+      </w:r>
+      <w:r>
+        <w:rPr>
+          <w:rFonts w:ascii="Times New Roman" w:hAnsi="Times New Roman" w:cs="Times New Roman"/>
+        </w:rPr>
+        <w:t>.</w:t>
+      </w:r>
+    </w:p>
+    <w:p>
+      <w:pPr>
+        <w:spacing w:line="240" w:lineRule="auto"/>
+        <w:rPr>
+          <w:rFonts w:ascii="Times New Roman" w:hAnsi="Times New Roman" w:cs="Times New Roman"/>
+          <w:b/>
+          <w:bCs/>
+        </w:rPr>
+      </w:pPr>
+      <w:r>
+        <w:rPr>
+          <w:rFonts w:ascii="Times New Roman" w:hAnsi="Times New Roman" w:cs="Times New Roman"/>
+          <w:b/>
+          <w:bCs/>
+        </w:rPr>
         <w:t>Future work</w:t>
       </w:r>
     </w:p>
@@ -2922,12 +3050,16 @@
         <w:spacing w:line="240" w:lineRule="auto"/>
         <w:rPr>
           <w:rFonts w:ascii="Times New Roman" w:hAnsi="Times New Roman" w:cs="Times New Roman"/>
+          <w:b/>
+          <w:bCs/>
           <w:sz w:val="24"/>
         </w:rPr>
       </w:pPr>
       <w:r>
         <w:rPr>
           <w:rFonts w:ascii="Times New Roman" w:hAnsi="Times New Roman" w:cs="Times New Roman"/>
+          <w:b/>
+          <w:bCs/>
           <w:sz w:val="24"/>
         </w:rPr>
         <w:t>MLP:</w:t>
@@ -3117,6 +3249,7 @@
           <w:sz w:val="16"/>
           <w:szCs w:val="16"/>
         </w:rPr>
+        <w:lastRenderedPageBreak/>
         <w:t>eta = 0.05</w:t>
       </w:r>
     </w:p>
@@ -3308,322 +3441,382 @@
           <w:sz w:val="16"/>
           <w:szCs w:val="16"/>
         </w:rPr>
+        <w:t xml:space="preserve">    return sigmoid(h.dot(W2) + b2)</w:t>
+      </w:r>
+    </w:p>
+    <w:p>
+      <w:pPr>
+        <w:spacing w:line="240" w:lineRule="auto"/>
+        <w:rPr>
+          <w:rFonts w:ascii="Consolas" w:hAnsi="Consolas" w:cs="Consolas"/>
+          <w:color w:val="275317" w:themeColor="accent6" w:themeShade="80"/>
+          <w:sz w:val="16"/>
+          <w:szCs w:val="16"/>
+        </w:rPr>
+      </w:pPr>
+    </w:p>
+    <w:p>
+      <w:pPr>
+        <w:spacing w:line="240" w:lineRule="auto"/>
+        <w:rPr>
+          <w:rFonts w:ascii="Consolas" w:hAnsi="Consolas" w:cs="Consolas"/>
+          <w:color w:val="275317" w:themeColor="accent6" w:themeShade="80"/>
+          <w:sz w:val="16"/>
+          <w:szCs w:val="16"/>
+        </w:rPr>
+      </w:pPr>
+      <w:r>
+        <w:rPr>
+          <w:rFonts w:ascii="Consolas" w:hAnsi="Consolas" w:cs="Consolas"/>
+          <w:color w:val="275317" w:themeColor="accent6" w:themeShade="80"/>
+          <w:sz w:val="16"/>
+          <w:szCs w:val="16"/>
+        </w:rPr>
+        <w:t>def compute_bce_loss(Y_true, Y_pred):</w:t>
+      </w:r>
+    </w:p>
+    <w:p>
+      <w:pPr>
+        <w:spacing w:line="240" w:lineRule="auto"/>
+        <w:rPr>
+          <w:rFonts w:ascii="Consolas" w:hAnsi="Consolas" w:cs="Consolas"/>
+          <w:color w:val="275317" w:themeColor="accent6" w:themeShade="80"/>
+          <w:sz w:val="16"/>
+          <w:szCs w:val="16"/>
+        </w:rPr>
+      </w:pPr>
+      <w:r>
+        <w:rPr>
+          <w:rFonts w:ascii="Consolas" w:hAnsi="Consolas" w:cs="Consolas"/>
+          <w:color w:val="275317" w:themeColor="accent6" w:themeShade="80"/>
+          <w:sz w:val="16"/>
+          <w:szCs w:val="16"/>
+        </w:rPr>
+        <w:t xml:space="preserve">    epsilon = 1e-8</w:t>
+      </w:r>
+    </w:p>
+    <w:p>
+      <w:pPr>
+        <w:spacing w:line="240" w:lineRule="auto"/>
+        <w:rPr>
+          <w:rFonts w:ascii="Consolas" w:hAnsi="Consolas" w:cs="Consolas"/>
+          <w:color w:val="275317" w:themeColor="accent6" w:themeShade="80"/>
+          <w:sz w:val="16"/>
+          <w:szCs w:val="16"/>
+        </w:rPr>
+      </w:pPr>
+      <w:r>
+        <w:rPr>
+          <w:rFonts w:ascii="Consolas" w:hAnsi="Consolas" w:cs="Consolas"/>
+          <w:color w:val="275317" w:themeColor="accent6" w:themeShade="80"/>
+          <w:sz w:val="16"/>
+          <w:szCs w:val="16"/>
+        </w:rPr>
+        <w:t xml:space="preserve">    Y_pred = np.clip(Y_pred, epsilon, 1 - epsilon)</w:t>
+      </w:r>
+    </w:p>
+    <w:p>
+      <w:pPr>
+        <w:spacing w:line="240" w:lineRule="auto"/>
+        <w:ind w:firstLine="440"/>
+        <w:rPr>
+          <w:rFonts w:ascii="Consolas" w:hAnsi="Consolas" w:cs="Consolas"/>
+          <w:color w:val="275317" w:themeColor="accent6" w:themeShade="80"/>
+          <w:sz w:val="16"/>
+          <w:szCs w:val="16"/>
+        </w:rPr>
+      </w:pPr>
+      <w:r>
+        <w:rPr>
+          <w:rFonts w:ascii="Consolas" w:hAnsi="Consolas" w:cs="Consolas"/>
+          <w:color w:val="275317" w:themeColor="accent6" w:themeShade="80"/>
+          <w:sz w:val="16"/>
+          <w:szCs w:val="16"/>
+        </w:rPr>
+        <w:t>return -np.mean(Y_true * np.log(Y_pred) + (1 - Y_true) * np.log(1 - Y_pred))</w:t>
+      </w:r>
+    </w:p>
+    <w:p>
+      <w:pPr>
+        <w:spacing w:line="240" w:lineRule="auto"/>
+        <w:ind w:firstLine="440"/>
+        <w:rPr>
+          <w:rFonts w:ascii="Consolas" w:hAnsi="Consolas" w:cs="Consolas"/>
+          <w:color w:val="275317" w:themeColor="accent6" w:themeShade="80"/>
+          <w:sz w:val="16"/>
+          <w:szCs w:val="16"/>
+        </w:rPr>
+      </w:pPr>
+    </w:p>
+    <w:p>
+      <w:pPr>
+        <w:spacing w:line="240" w:lineRule="auto"/>
+        <w:rPr>
+          <w:rFonts w:ascii="Consolas" w:hAnsi="Consolas" w:cs="Consolas"/>
+          <w:color w:val="275317" w:themeColor="accent6" w:themeShade="80"/>
+          <w:sz w:val="16"/>
+          <w:szCs w:val="16"/>
+        </w:rPr>
+      </w:pPr>
+      <w:r>
+        <w:rPr>
+          <w:rFonts w:ascii="Consolas" w:hAnsi="Consolas" w:cs="Consolas"/>
+          <w:color w:val="275317" w:themeColor="accent6" w:themeShade="80"/>
+          <w:sz w:val="16"/>
+          <w:szCs w:val="16"/>
+        </w:rPr>
+        <w:t>errors = []</w:t>
+      </w:r>
+    </w:p>
+    <w:p>
+      <w:pPr>
+        <w:spacing w:line="240" w:lineRule="auto"/>
+        <w:rPr>
+          <w:rFonts w:ascii="Consolas" w:hAnsi="Consolas" w:cs="Consolas"/>
+          <w:color w:val="275317" w:themeColor="accent6" w:themeShade="80"/>
+          <w:sz w:val="16"/>
+          <w:szCs w:val="16"/>
+        </w:rPr>
+      </w:pPr>
+    </w:p>
+    <w:p>
+      <w:pPr>
+        <w:spacing w:line="240" w:lineRule="auto"/>
+        <w:rPr>
+          <w:rFonts w:ascii="Consolas" w:hAnsi="Consolas" w:cs="Consolas"/>
+          <w:color w:val="275317" w:themeColor="accent6" w:themeShade="80"/>
+          <w:sz w:val="16"/>
+          <w:szCs w:val="16"/>
+        </w:rPr>
+      </w:pPr>
+      <w:r>
+        <w:rPr>
+          <w:rFonts w:ascii="Consolas" w:hAnsi="Consolas" w:cs="Consolas"/>
+          <w:color w:val="275317" w:themeColor="accent6" w:themeShade="80"/>
+          <w:sz w:val="16"/>
+          <w:szCs w:val="16"/>
+        </w:rPr>
+        <w:t>for epoch in range(epochs):</w:t>
+      </w:r>
+    </w:p>
+    <w:p>
+      <w:pPr>
+        <w:spacing w:line="240" w:lineRule="auto"/>
+        <w:rPr>
+          <w:rFonts w:ascii="Consolas" w:hAnsi="Consolas" w:cs="Consolas"/>
+          <w:color w:val="275317" w:themeColor="accent6" w:themeShade="80"/>
+          <w:sz w:val="16"/>
+          <w:szCs w:val="16"/>
+        </w:rPr>
+      </w:pPr>
+      <w:r>
+        <w:rPr>
+          <w:rFonts w:ascii="Consolas" w:hAnsi="Consolas" w:cs="Consolas"/>
+          <w:color w:val="275317" w:themeColor="accent6" w:themeShade="80"/>
+          <w:sz w:val="16"/>
+          <w:szCs w:val="16"/>
+        </w:rPr>
+        <w:t xml:space="preserve">    h = np.maximum(0, X_train.dot(W1) + b1) </w:t>
+      </w:r>
+    </w:p>
+    <w:p>
+      <w:pPr>
+        <w:spacing w:line="240" w:lineRule="auto"/>
+        <w:rPr>
+          <w:rFonts w:ascii="Consolas" w:hAnsi="Consolas" w:cs="Consolas"/>
+          <w:color w:val="275317" w:themeColor="accent6" w:themeShade="80"/>
+          <w:sz w:val="16"/>
+          <w:szCs w:val="16"/>
+        </w:rPr>
+      </w:pPr>
+      <w:r>
+        <w:rPr>
+          <w:rFonts w:ascii="Consolas" w:hAnsi="Consolas" w:cs="Consolas"/>
+          <w:color w:val="275317" w:themeColor="accent6" w:themeShade="80"/>
+          <w:sz w:val="16"/>
+          <w:szCs w:val="16"/>
+        </w:rPr>
+        <w:t xml:space="preserve">    y_pred = sigmoid(h.dot(W2) + b2)</w:t>
+      </w:r>
+    </w:p>
+    <w:p>
+      <w:pPr>
+        <w:spacing w:line="240" w:lineRule="auto"/>
+        <w:rPr>
+          <w:rFonts w:ascii="Consolas" w:hAnsi="Consolas" w:cs="Consolas"/>
+          <w:color w:val="275317" w:themeColor="accent6" w:themeShade="80"/>
+          <w:sz w:val="16"/>
+          <w:szCs w:val="16"/>
+        </w:rPr>
+      </w:pPr>
+      <w:r>
+        <w:rPr>
+          <w:rFonts w:ascii="Consolas" w:hAnsi="Consolas" w:cs="Consolas"/>
+          <w:color w:val="275317" w:themeColor="accent6" w:themeShade="80"/>
+          <w:sz w:val="16"/>
+          <w:szCs w:val="16"/>
+        </w:rPr>
+        <w:t xml:space="preserve">    dy = y_pred - Y_train </w:t>
+      </w:r>
+    </w:p>
+    <w:p>
+      <w:pPr>
+        <w:spacing w:line="240" w:lineRule="auto"/>
+        <w:rPr>
+          <w:rFonts w:ascii="Consolas" w:hAnsi="Consolas" w:cs="Consolas"/>
+          <w:color w:val="275317" w:themeColor="accent6" w:themeShade="80"/>
+          <w:sz w:val="16"/>
+          <w:szCs w:val="16"/>
+        </w:rPr>
+      </w:pPr>
+      <w:r>
+        <w:rPr>
+          <w:rFonts w:ascii="Consolas" w:hAnsi="Consolas" w:cs="Consolas"/>
+          <w:color w:val="275317" w:themeColor="accent6" w:themeShade="80"/>
+          <w:sz w:val="16"/>
+          <w:szCs w:val="16"/>
+        </w:rPr>
+        <w:t xml:space="preserve">    dW2 = h.T.dot(dy) / n</w:t>
+      </w:r>
+    </w:p>
+    <w:p>
+      <w:pPr>
+        <w:spacing w:line="240" w:lineRule="auto"/>
+        <w:rPr>
+          <w:rFonts w:ascii="Consolas" w:hAnsi="Consolas" w:cs="Consolas"/>
+          <w:color w:val="275317" w:themeColor="accent6" w:themeShade="80"/>
+          <w:sz w:val="16"/>
+          <w:szCs w:val="16"/>
+        </w:rPr>
+      </w:pPr>
+      <w:r>
+        <w:rPr>
+          <w:rFonts w:ascii="Consolas" w:hAnsi="Consolas" w:cs="Consolas"/>
+          <w:color w:val="275317" w:themeColor="accent6" w:themeShade="80"/>
+          <w:sz w:val="16"/>
+          <w:szCs w:val="16"/>
+        </w:rPr>
+        <w:t xml:space="preserve">    db2 = np.sum(dy, axis=0, keepdims=True) / n</w:t>
+      </w:r>
+    </w:p>
+    <w:p>
+      <w:pPr>
+        <w:spacing w:line="240" w:lineRule="auto"/>
+        <w:rPr>
+          <w:rFonts w:ascii="Consolas" w:hAnsi="Consolas" w:cs="Consolas"/>
+          <w:color w:val="275317" w:themeColor="accent6" w:themeShade="80"/>
+          <w:sz w:val="16"/>
+          <w:szCs w:val="16"/>
+        </w:rPr>
+      </w:pPr>
+      <w:r>
+        <w:rPr>
+          <w:rFonts w:ascii="Consolas" w:hAnsi="Consolas" w:cs="Consolas"/>
+          <w:color w:val="275317" w:themeColor="accent6" w:themeShade="80"/>
+          <w:sz w:val="16"/>
+          <w:szCs w:val="16"/>
+        </w:rPr>
+        <w:t xml:space="preserve">    mat1 = np.heaviside(h, 0) </w:t>
+      </w:r>
+    </w:p>
+    <w:p>
+      <w:pPr>
+        <w:spacing w:line="240" w:lineRule="auto"/>
+        <w:rPr>
+          <w:rFonts w:ascii="Consolas" w:hAnsi="Consolas" w:cs="Consolas"/>
+          <w:color w:val="275317" w:themeColor="accent6" w:themeShade="80"/>
+          <w:sz w:val="16"/>
+          <w:szCs w:val="16"/>
+        </w:rPr>
+      </w:pPr>
+      <w:r>
+        <w:rPr>
+          <w:rFonts w:ascii="Consolas" w:hAnsi="Consolas" w:cs="Consolas"/>
+          <w:color w:val="275317" w:themeColor="accent6" w:themeShade="80"/>
+          <w:sz w:val="16"/>
+          <w:szCs w:val="16"/>
+        </w:rPr>
+        <w:t xml:space="preserve">    dh = dy.dot(W2.T)</w:t>
+      </w:r>
+    </w:p>
+    <w:p>
+      <w:pPr>
+        <w:spacing w:line="240" w:lineRule="auto"/>
+        <w:rPr>
+          <w:rFonts w:ascii="Consolas" w:hAnsi="Consolas" w:cs="Consolas"/>
+          <w:color w:val="275317" w:themeColor="accent6" w:themeShade="80"/>
+          <w:sz w:val="16"/>
+          <w:szCs w:val="16"/>
+        </w:rPr>
+      </w:pPr>
+      <w:r>
+        <w:rPr>
+          <w:rFonts w:ascii="Consolas" w:hAnsi="Consolas" w:cs="Consolas"/>
+          <w:color w:val="275317" w:themeColor="accent6" w:themeShade="80"/>
+          <w:sz w:val="16"/>
+          <w:szCs w:val="16"/>
+        </w:rPr>
+        <w:t xml:space="preserve">    </w:t>
+      </w:r>
+    </w:p>
+    <w:p>
+      <w:pPr>
+        <w:spacing w:line="240" w:lineRule="auto"/>
+        <w:rPr>
+          <w:rFonts w:ascii="Consolas" w:hAnsi="Consolas" w:cs="Consolas"/>
+          <w:color w:val="275317" w:themeColor="accent6" w:themeShade="80"/>
+          <w:sz w:val="16"/>
+          <w:szCs w:val="16"/>
+        </w:rPr>
+      </w:pPr>
+      <w:r>
+        <w:rPr>
+          <w:rFonts w:ascii="Consolas" w:hAnsi="Consolas" w:cs="Consolas"/>
+          <w:color w:val="275317" w:themeColor="accent6" w:themeShade="80"/>
+          <w:sz w:val="16"/>
+          <w:szCs w:val="16"/>
+        </w:rPr>
+        <w:t xml:space="preserve">    dW1 = X_train.T.dot(dh * mat1) / n</w:t>
+      </w:r>
+    </w:p>
+    <w:p>
+      <w:pPr>
+        <w:spacing w:line="240" w:lineRule="auto"/>
+        <w:rPr>
+          <w:rFonts w:ascii="Consolas" w:hAnsi="Consolas" w:cs="Consolas"/>
+          <w:color w:val="275317" w:themeColor="accent6" w:themeShade="80"/>
+          <w:sz w:val="16"/>
+          <w:szCs w:val="16"/>
+        </w:rPr>
+      </w:pPr>
+      <w:r>
+        <w:rPr>
+          <w:rFonts w:ascii="Consolas" w:hAnsi="Consolas" w:cs="Consolas"/>
+          <w:color w:val="275317" w:themeColor="accent6" w:themeShade="80"/>
+          <w:sz w:val="16"/>
+          <w:szCs w:val="16"/>
+        </w:rPr>
+        <w:t xml:space="preserve">    db1 = np.sum(dh * mat1, axis=0, keepdims=True) / n</w:t>
+      </w:r>
+    </w:p>
+    <w:p>
+      <w:pPr>
+        <w:spacing w:line="240" w:lineRule="auto"/>
+        <w:rPr>
+          <w:rFonts w:ascii="Consolas" w:hAnsi="Consolas" w:cs="Consolas"/>
+          <w:color w:val="275317" w:themeColor="accent6" w:themeShade="80"/>
+          <w:sz w:val="16"/>
+          <w:szCs w:val="16"/>
+        </w:rPr>
+      </w:pPr>
+      <w:r>
+        <w:rPr>
+          <w:rFonts w:ascii="Consolas" w:hAnsi="Consolas" w:cs="Consolas"/>
+          <w:color w:val="275317" w:themeColor="accent6" w:themeShade="80"/>
+          <w:sz w:val="16"/>
+          <w:szCs w:val="16"/>
+        </w:rPr>
         <w:lastRenderedPageBreak/>
-        <w:t xml:space="preserve">    return sigmoid(h.dot(W2) + b2)</w:t>
-      </w:r>
-    </w:p>
-    <w:p>
-      <w:pPr>
-        <w:spacing w:line="240" w:lineRule="auto"/>
-        <w:rPr>
-          <w:rFonts w:ascii="Consolas" w:hAnsi="Consolas" w:cs="Consolas"/>
-          <w:color w:val="275317" w:themeColor="accent6" w:themeShade="80"/>
-          <w:sz w:val="16"/>
-          <w:szCs w:val="16"/>
-        </w:rPr>
-      </w:pPr>
-    </w:p>
-    <w:p>
-      <w:pPr>
-        <w:spacing w:line="240" w:lineRule="auto"/>
-        <w:rPr>
-          <w:rFonts w:ascii="Consolas" w:hAnsi="Consolas" w:cs="Consolas"/>
-          <w:color w:val="275317" w:themeColor="accent6" w:themeShade="80"/>
-          <w:sz w:val="16"/>
-          <w:szCs w:val="16"/>
-        </w:rPr>
-      </w:pPr>
-      <w:r>
-        <w:rPr>
-          <w:rFonts w:ascii="Consolas" w:hAnsi="Consolas" w:cs="Consolas"/>
-          <w:color w:val="275317" w:themeColor="accent6" w:themeShade="80"/>
-          <w:sz w:val="16"/>
-          <w:szCs w:val="16"/>
-        </w:rPr>
-        <w:t>def compute_bce_loss(Y_true, Y_pred):</w:t>
-      </w:r>
-    </w:p>
-    <w:p>
-      <w:pPr>
-        <w:spacing w:line="240" w:lineRule="auto"/>
-        <w:rPr>
-          <w:rFonts w:ascii="Consolas" w:hAnsi="Consolas" w:cs="Consolas"/>
-          <w:color w:val="275317" w:themeColor="accent6" w:themeShade="80"/>
-          <w:sz w:val="16"/>
-          <w:szCs w:val="16"/>
-        </w:rPr>
-      </w:pPr>
-      <w:r>
-        <w:rPr>
-          <w:rFonts w:ascii="Consolas" w:hAnsi="Consolas" w:cs="Consolas"/>
-          <w:color w:val="275317" w:themeColor="accent6" w:themeShade="80"/>
-          <w:sz w:val="16"/>
-          <w:szCs w:val="16"/>
-        </w:rPr>
-        <w:t xml:space="preserve">    epsilon = 1e-8</w:t>
-      </w:r>
-    </w:p>
-    <w:p>
-      <w:pPr>
-        <w:spacing w:line="240" w:lineRule="auto"/>
-        <w:rPr>
-          <w:rFonts w:ascii="Consolas" w:hAnsi="Consolas" w:cs="Consolas"/>
-          <w:color w:val="275317" w:themeColor="accent6" w:themeShade="80"/>
-          <w:sz w:val="16"/>
-          <w:szCs w:val="16"/>
-        </w:rPr>
-      </w:pPr>
-      <w:r>
-        <w:rPr>
-          <w:rFonts w:ascii="Consolas" w:hAnsi="Consolas" w:cs="Consolas"/>
-          <w:color w:val="275317" w:themeColor="accent6" w:themeShade="80"/>
-          <w:sz w:val="16"/>
-          <w:szCs w:val="16"/>
-        </w:rPr>
-        <w:t xml:space="preserve">    Y_pred = np.clip(Y_pred, epsilon, 1 - epsilon)</w:t>
-      </w:r>
-    </w:p>
-    <w:p>
-      <w:pPr>
-        <w:spacing w:line="240" w:lineRule="auto"/>
-        <w:ind w:firstLine="440"/>
-        <w:rPr>
-          <w:rFonts w:ascii="Consolas" w:hAnsi="Consolas" w:cs="Consolas"/>
-          <w:color w:val="275317" w:themeColor="accent6" w:themeShade="80"/>
-          <w:sz w:val="16"/>
-          <w:szCs w:val="16"/>
-        </w:rPr>
-      </w:pPr>
-      <w:r>
-        <w:rPr>
-          <w:rFonts w:ascii="Consolas" w:hAnsi="Consolas" w:cs="Consolas"/>
-          <w:color w:val="275317" w:themeColor="accent6" w:themeShade="80"/>
-          <w:sz w:val="16"/>
-          <w:szCs w:val="16"/>
-        </w:rPr>
-        <w:t>return -np.mean(Y_true * np.log(Y_pred) + (1 - Y_true) * np.log(1 - Y_pred))</w:t>
-      </w:r>
-    </w:p>
-    <w:p>
-      <w:pPr>
-        <w:spacing w:line="240" w:lineRule="auto"/>
-        <w:ind w:firstLine="440"/>
-        <w:rPr>
-          <w:rFonts w:ascii="Consolas" w:hAnsi="Consolas" w:cs="Consolas"/>
-          <w:color w:val="275317" w:themeColor="accent6" w:themeShade="80"/>
-          <w:sz w:val="16"/>
-          <w:szCs w:val="16"/>
-        </w:rPr>
-      </w:pPr>
-    </w:p>
-    <w:p>
-      <w:pPr>
-        <w:spacing w:line="240" w:lineRule="auto"/>
-        <w:rPr>
-          <w:rFonts w:ascii="Consolas" w:hAnsi="Consolas" w:cs="Consolas"/>
-          <w:color w:val="275317" w:themeColor="accent6" w:themeShade="80"/>
-          <w:sz w:val="16"/>
-          <w:szCs w:val="16"/>
-        </w:rPr>
-      </w:pPr>
-      <w:r>
-        <w:rPr>
-          <w:rFonts w:ascii="Consolas" w:hAnsi="Consolas" w:cs="Consolas"/>
-          <w:color w:val="275317" w:themeColor="accent6" w:themeShade="80"/>
-          <w:sz w:val="16"/>
-          <w:szCs w:val="16"/>
-        </w:rPr>
-        <w:t>errors = []</w:t>
-      </w:r>
-    </w:p>
-    <w:p>
-      <w:pPr>
-        <w:spacing w:line="240" w:lineRule="auto"/>
-        <w:rPr>
-          <w:rFonts w:ascii="Consolas" w:hAnsi="Consolas" w:cs="Consolas"/>
-          <w:color w:val="275317" w:themeColor="accent6" w:themeShade="80"/>
-          <w:sz w:val="16"/>
-          <w:szCs w:val="16"/>
-        </w:rPr>
-      </w:pPr>
-    </w:p>
-    <w:p>
-      <w:pPr>
-        <w:spacing w:line="240" w:lineRule="auto"/>
-        <w:rPr>
-          <w:rFonts w:ascii="Consolas" w:hAnsi="Consolas" w:cs="Consolas"/>
-          <w:color w:val="275317" w:themeColor="accent6" w:themeShade="80"/>
-          <w:sz w:val="16"/>
-          <w:szCs w:val="16"/>
-        </w:rPr>
-      </w:pPr>
-      <w:r>
-        <w:rPr>
-          <w:rFonts w:ascii="Consolas" w:hAnsi="Consolas" w:cs="Consolas"/>
-          <w:color w:val="275317" w:themeColor="accent6" w:themeShade="80"/>
-          <w:sz w:val="16"/>
-          <w:szCs w:val="16"/>
-        </w:rPr>
-        <w:t>for epoch in range(epochs):</w:t>
-      </w:r>
-    </w:p>
-    <w:p>
-      <w:pPr>
-        <w:spacing w:line="240" w:lineRule="auto"/>
-        <w:rPr>
-          <w:rFonts w:ascii="Consolas" w:hAnsi="Consolas" w:cs="Consolas"/>
-          <w:color w:val="275317" w:themeColor="accent6" w:themeShade="80"/>
-          <w:sz w:val="16"/>
-          <w:szCs w:val="16"/>
-        </w:rPr>
-      </w:pPr>
-      <w:r>
-        <w:rPr>
-          <w:rFonts w:ascii="Consolas" w:hAnsi="Consolas" w:cs="Consolas"/>
-          <w:color w:val="275317" w:themeColor="accent6" w:themeShade="80"/>
-          <w:sz w:val="16"/>
-          <w:szCs w:val="16"/>
-        </w:rPr>
-        <w:t xml:space="preserve">    h = np.maximum(0, X_train.dot(W1) + b1) </w:t>
-      </w:r>
-    </w:p>
-    <w:p>
-      <w:pPr>
-        <w:spacing w:line="240" w:lineRule="auto"/>
-        <w:rPr>
-          <w:rFonts w:ascii="Consolas" w:hAnsi="Consolas" w:cs="Consolas"/>
-          <w:color w:val="275317" w:themeColor="accent6" w:themeShade="80"/>
-          <w:sz w:val="16"/>
-          <w:szCs w:val="16"/>
-        </w:rPr>
-      </w:pPr>
-      <w:r>
-        <w:rPr>
-          <w:rFonts w:ascii="Consolas" w:hAnsi="Consolas" w:cs="Consolas"/>
-          <w:color w:val="275317" w:themeColor="accent6" w:themeShade="80"/>
-          <w:sz w:val="16"/>
-          <w:szCs w:val="16"/>
-        </w:rPr>
-        <w:t xml:space="preserve">    y_pred = sigmoid(h.dot(W2) + b2)</w:t>
-      </w:r>
-    </w:p>
-    <w:p>
-      <w:pPr>
-        <w:spacing w:line="240" w:lineRule="auto"/>
-        <w:rPr>
-          <w:rFonts w:ascii="Consolas" w:hAnsi="Consolas" w:cs="Consolas"/>
-          <w:color w:val="275317" w:themeColor="accent6" w:themeShade="80"/>
-          <w:sz w:val="16"/>
-          <w:szCs w:val="16"/>
-        </w:rPr>
-      </w:pPr>
-      <w:r>
-        <w:rPr>
-          <w:rFonts w:ascii="Consolas" w:hAnsi="Consolas" w:cs="Consolas"/>
-          <w:color w:val="275317" w:themeColor="accent6" w:themeShade="80"/>
-          <w:sz w:val="16"/>
-          <w:szCs w:val="16"/>
-        </w:rPr>
-        <w:t xml:space="preserve">    dy = y_pred - Y_train </w:t>
-      </w:r>
-    </w:p>
-    <w:p>
-      <w:pPr>
-        <w:spacing w:line="240" w:lineRule="auto"/>
-        <w:rPr>
-          <w:rFonts w:ascii="Consolas" w:hAnsi="Consolas" w:cs="Consolas"/>
-          <w:color w:val="275317" w:themeColor="accent6" w:themeShade="80"/>
-          <w:sz w:val="16"/>
-          <w:szCs w:val="16"/>
-        </w:rPr>
-      </w:pPr>
-      <w:r>
-        <w:rPr>
-          <w:rFonts w:ascii="Consolas" w:hAnsi="Consolas" w:cs="Consolas"/>
-          <w:color w:val="275317" w:themeColor="accent6" w:themeShade="80"/>
-          <w:sz w:val="16"/>
-          <w:szCs w:val="16"/>
-        </w:rPr>
-        <w:t xml:space="preserve">    dW2 = h.T.dot(dy) / n</w:t>
-      </w:r>
-    </w:p>
-    <w:p>
-      <w:pPr>
-        <w:spacing w:line="240" w:lineRule="auto"/>
-        <w:rPr>
-          <w:rFonts w:ascii="Consolas" w:hAnsi="Consolas" w:cs="Consolas"/>
-          <w:color w:val="275317" w:themeColor="accent6" w:themeShade="80"/>
-          <w:sz w:val="16"/>
-          <w:szCs w:val="16"/>
-        </w:rPr>
-      </w:pPr>
-      <w:r>
-        <w:rPr>
-          <w:rFonts w:ascii="Consolas" w:hAnsi="Consolas" w:cs="Consolas"/>
-          <w:color w:val="275317" w:themeColor="accent6" w:themeShade="80"/>
-          <w:sz w:val="16"/>
-          <w:szCs w:val="16"/>
-        </w:rPr>
-        <w:t xml:space="preserve">    db2 = np.sum(dy, axis=0, keepdims=True) / n</w:t>
-      </w:r>
-    </w:p>
-    <w:p>
-      <w:pPr>
-        <w:spacing w:line="240" w:lineRule="auto"/>
-        <w:rPr>
-          <w:rFonts w:ascii="Consolas" w:hAnsi="Consolas" w:cs="Consolas"/>
-          <w:color w:val="275317" w:themeColor="accent6" w:themeShade="80"/>
-          <w:sz w:val="16"/>
-          <w:szCs w:val="16"/>
-        </w:rPr>
-      </w:pPr>
-      <w:r>
-        <w:rPr>
-          <w:rFonts w:ascii="Consolas" w:hAnsi="Consolas" w:cs="Consolas"/>
-          <w:color w:val="275317" w:themeColor="accent6" w:themeShade="80"/>
-          <w:sz w:val="16"/>
-          <w:szCs w:val="16"/>
-        </w:rPr>
-        <w:t xml:space="preserve">    mat1 = np.heaviside(h, 0) </w:t>
-      </w:r>
-    </w:p>
-    <w:p>
-      <w:pPr>
-        <w:spacing w:line="240" w:lineRule="auto"/>
-        <w:rPr>
-          <w:rFonts w:ascii="Consolas" w:hAnsi="Consolas" w:cs="Consolas"/>
-          <w:color w:val="275317" w:themeColor="accent6" w:themeShade="80"/>
-          <w:sz w:val="16"/>
-          <w:szCs w:val="16"/>
-        </w:rPr>
-      </w:pPr>
-      <w:r>
-        <w:rPr>
-          <w:rFonts w:ascii="Consolas" w:hAnsi="Consolas" w:cs="Consolas"/>
-          <w:color w:val="275317" w:themeColor="accent6" w:themeShade="80"/>
-          <w:sz w:val="16"/>
-          <w:szCs w:val="16"/>
-        </w:rPr>
-        <w:t xml:space="preserve">    dh = dy.dot(W2.T)</w:t>
-      </w:r>
-    </w:p>
-    <w:p>
-      <w:pPr>
-        <w:spacing w:line="240" w:lineRule="auto"/>
-        <w:rPr>
-          <w:rFonts w:ascii="Consolas" w:hAnsi="Consolas" w:cs="Consolas"/>
-          <w:color w:val="275317" w:themeColor="accent6" w:themeShade="80"/>
-          <w:sz w:val="16"/>
-          <w:szCs w:val="16"/>
-        </w:rPr>
-      </w:pPr>
-      <w:r>
-        <w:rPr>
-          <w:rFonts w:ascii="Consolas" w:hAnsi="Consolas" w:cs="Consolas"/>
-          <w:color w:val="275317" w:themeColor="accent6" w:themeShade="80"/>
-          <w:sz w:val="16"/>
-          <w:szCs w:val="16"/>
-        </w:rPr>
         <w:t xml:space="preserve">    </w:t>
       </w:r>
     </w:p>
@@ -3644,66 +3837,6 @@
           <w:sz w:val="16"/>
           <w:szCs w:val="16"/>
         </w:rPr>
-        <w:t xml:space="preserve">    dW1 = X_train.T.dot(dh * mat1) / n</w:t>
-      </w:r>
-    </w:p>
-    <w:p>
-      <w:pPr>
-        <w:spacing w:line="240" w:lineRule="auto"/>
-        <w:rPr>
-          <w:rFonts w:ascii="Consolas" w:hAnsi="Consolas" w:cs="Consolas"/>
-          <w:color w:val="275317" w:themeColor="accent6" w:themeShade="80"/>
-          <w:sz w:val="16"/>
-          <w:szCs w:val="16"/>
-        </w:rPr>
-      </w:pPr>
-      <w:r>
-        <w:rPr>
-          <w:rFonts w:ascii="Consolas" w:hAnsi="Consolas" w:cs="Consolas"/>
-          <w:color w:val="275317" w:themeColor="accent6" w:themeShade="80"/>
-          <w:sz w:val="16"/>
-          <w:szCs w:val="16"/>
-        </w:rPr>
-        <w:t xml:space="preserve">    db1 = np.sum(dh * mat1, axis=0, keepdims=True) / n</w:t>
-      </w:r>
-    </w:p>
-    <w:p>
-      <w:pPr>
-        <w:spacing w:line="240" w:lineRule="auto"/>
-        <w:rPr>
-          <w:rFonts w:ascii="Consolas" w:hAnsi="Consolas" w:cs="Consolas"/>
-          <w:color w:val="275317" w:themeColor="accent6" w:themeShade="80"/>
-          <w:sz w:val="16"/>
-          <w:szCs w:val="16"/>
-        </w:rPr>
-      </w:pPr>
-      <w:r>
-        <w:rPr>
-          <w:rFonts w:ascii="Consolas" w:hAnsi="Consolas" w:cs="Consolas"/>
-          <w:color w:val="275317" w:themeColor="accent6" w:themeShade="80"/>
-          <w:sz w:val="16"/>
-          <w:szCs w:val="16"/>
-        </w:rPr>
-        <w:t xml:space="preserve">    </w:t>
-      </w:r>
-    </w:p>
-    <w:p>
-      <w:pPr>
-        <w:spacing w:line="240" w:lineRule="auto"/>
-        <w:rPr>
-          <w:rFonts w:ascii="Consolas" w:hAnsi="Consolas" w:cs="Consolas"/>
-          <w:color w:val="275317" w:themeColor="accent6" w:themeShade="80"/>
-          <w:sz w:val="16"/>
-          <w:szCs w:val="16"/>
-        </w:rPr>
-      </w:pPr>
-      <w:r>
-        <w:rPr>
-          <w:rFonts w:ascii="Consolas" w:hAnsi="Consolas" w:cs="Consolas"/>
-          <w:color w:val="275317" w:themeColor="accent6" w:themeShade="80"/>
-          <w:sz w:val="16"/>
-          <w:szCs w:val="16"/>
-        </w:rPr>
         <w:t xml:space="preserve">    W2 = W2 - eta * dW2</w:t>
       </w:r>
     </w:p>
@@ -3875,7 +4008,6 @@
           <w:sz w:val="16"/>
           <w:szCs w:val="16"/>
         </w:rPr>
-        <w:lastRenderedPageBreak/>
         <w:t xml:space="preserve">            print(f"Epoch {epoch:&lt;4} | Loss: {e:.4f}")</w:t>
       </w:r>
     </w:p>
@@ -3900,31 +4032,19 @@
         <w:spacing w:line="240" w:lineRule="auto"/>
         <w:rPr>
           <w:rFonts w:ascii="Times New Roman" w:hAnsi="Times New Roman" w:cs="Times New Roman"/>
-          <w:sz w:val="24"/>
-        </w:rPr>
-      </w:pPr>
-    </w:p>
-    <w:p>
-      <w:pPr>
-        <w:spacing w:line="240" w:lineRule="auto"/>
-        <w:rPr>
-          <w:rFonts w:ascii="Times New Roman" w:hAnsi="Times New Roman" w:cs="Times New Roman"/>
-          <w:szCs w:val="22"/>
-        </w:rPr>
-      </w:pPr>
-      <w:r>
-        <w:rPr>
-          <w:rFonts w:ascii="Times New Roman" w:hAnsi="Times New Roman" w:cs="Times New Roman"/>
-          <w:szCs w:val="22"/>
-        </w:rPr>
-        <w:t>BLR</w:t>
-      </w:r>
-      <w:r>
-        <w:rPr>
-          <w:rFonts w:ascii="Times New Roman" w:hAnsi="Times New Roman" w:cs="Times New Roman"/>
-          <w:szCs w:val="22"/>
-        </w:rPr>
-        <w:t xml:space="preserve"> In R:</w:t>
+          <w:b/>
+          <w:bCs/>
+          <w:szCs w:val="22"/>
+        </w:rPr>
+      </w:pPr>
+      <w:r>
+        <w:rPr>
+          <w:rFonts w:ascii="Times New Roman" w:hAnsi="Times New Roman" w:cs="Times New Roman"/>
+          <w:b/>
+          <w:bCs/>
+          <w:szCs w:val="22"/>
+        </w:rPr>
+        <w:t>BLR In R:</w:t>
       </w:r>
     </w:p>
     <w:p>
@@ -4604,18 +4724,18 @@
     <w:lsdException w:name="Unresolved Mention" w:semiHidden="1" w:unhideWhenUsed="1"/>
     <w:lsdException w:name="Smart Link" w:semiHidden="1" w:unhideWhenUsed="1"/>
   </w:latentStyles>
-  <w:style w:type="paragraph" w:default="1" w:styleId="Normal">
+  <w:style w:type="paragraph" w:default="1" w:styleId="a">
     <w:name w:val="Normal"/>
     <w:qFormat/>
     <w:pPr>
       <w:widowControl w:val="0"/>
     </w:pPr>
   </w:style>
-  <w:style w:type="paragraph" w:styleId="Heading1">
+  <w:style w:type="paragraph" w:styleId="1">
     <w:name w:val="heading 1"/>
-    <w:basedOn w:val="Normal"/>
-    <w:next w:val="Normal"/>
-    <w:link w:val="Heading1Char"/>
+    <w:basedOn w:val="a"/>
+    <w:next w:val="a"/>
+    <w:link w:val="10"/>
     <w:uiPriority w:val="9"/>
     <w:qFormat/>
     <w:rsid w:val="00005A1C"/>
@@ -4632,11 +4752,11 @@
       <w:szCs w:val="48"/>
     </w:rPr>
   </w:style>
-  <w:style w:type="paragraph" w:styleId="Heading2">
+  <w:style w:type="paragraph" w:styleId="2">
     <w:name w:val="heading 2"/>
-    <w:basedOn w:val="Normal"/>
-    <w:next w:val="Normal"/>
-    <w:link w:val="Heading2Char"/>
+    <w:basedOn w:val="a"/>
+    <w:next w:val="a"/>
+    <w:link w:val="20"/>
     <w:uiPriority w:val="9"/>
     <w:semiHidden/>
     <w:unhideWhenUsed/>
@@ -4655,11 +4775,11 @@
       <w:szCs w:val="40"/>
     </w:rPr>
   </w:style>
-  <w:style w:type="paragraph" w:styleId="Heading3">
+  <w:style w:type="paragraph" w:styleId="3">
     <w:name w:val="heading 3"/>
-    <w:basedOn w:val="Normal"/>
-    <w:next w:val="Normal"/>
-    <w:link w:val="Heading3Char"/>
+    <w:basedOn w:val="a"/>
+    <w:next w:val="a"/>
+    <w:link w:val="30"/>
     <w:uiPriority w:val="9"/>
     <w:semiHidden/>
     <w:unhideWhenUsed/>
@@ -4678,11 +4798,11 @@
       <w:szCs w:val="32"/>
     </w:rPr>
   </w:style>
-  <w:style w:type="paragraph" w:styleId="Heading4">
+  <w:style w:type="paragraph" w:styleId="4">
     <w:name w:val="heading 4"/>
-    <w:basedOn w:val="Normal"/>
-    <w:next w:val="Normal"/>
-    <w:link w:val="Heading4Char"/>
+    <w:basedOn w:val="a"/>
+    <w:next w:val="a"/>
+    <w:link w:val="40"/>
     <w:uiPriority w:val="9"/>
     <w:semiHidden/>
     <w:unhideWhenUsed/>
@@ -4701,11 +4821,11 @@
       <w:szCs w:val="28"/>
     </w:rPr>
   </w:style>
-  <w:style w:type="paragraph" w:styleId="Heading5">
+  <w:style w:type="paragraph" w:styleId="5">
     <w:name w:val="heading 5"/>
-    <w:basedOn w:val="Normal"/>
-    <w:next w:val="Normal"/>
-    <w:link w:val="Heading5Char"/>
+    <w:basedOn w:val="a"/>
+    <w:next w:val="a"/>
+    <w:link w:val="50"/>
     <w:uiPriority w:val="9"/>
     <w:semiHidden/>
     <w:unhideWhenUsed/>
@@ -4723,11 +4843,11 @@
       <w:sz w:val="24"/>
     </w:rPr>
   </w:style>
-  <w:style w:type="paragraph" w:styleId="Heading6">
+  <w:style w:type="paragraph" w:styleId="6">
     <w:name w:val="heading 6"/>
-    <w:basedOn w:val="Normal"/>
-    <w:next w:val="Normal"/>
-    <w:link w:val="Heading6Char"/>
+    <w:basedOn w:val="a"/>
+    <w:next w:val="a"/>
+    <w:link w:val="60"/>
     <w:uiPriority w:val="9"/>
     <w:semiHidden/>
     <w:unhideWhenUsed/>
@@ -4746,11 +4866,11 @@
       <w:color w:val="0F4761" w:themeColor="accent1" w:themeShade="BF"/>
     </w:rPr>
   </w:style>
-  <w:style w:type="paragraph" w:styleId="Heading7">
+  <w:style w:type="paragraph" w:styleId="7">
     <w:name w:val="heading 7"/>
-    <w:basedOn w:val="Normal"/>
-    <w:next w:val="Normal"/>
-    <w:link w:val="Heading7Char"/>
+    <w:basedOn w:val="a"/>
+    <w:next w:val="a"/>
+    <w:link w:val="70"/>
     <w:uiPriority w:val="9"/>
     <w:semiHidden/>
     <w:unhideWhenUsed/>
@@ -4769,11 +4889,11 @@
       <w:color w:val="595959" w:themeColor="text1" w:themeTint="A6"/>
     </w:rPr>
   </w:style>
-  <w:style w:type="paragraph" w:styleId="Heading8">
+  <w:style w:type="paragraph" w:styleId="8">
     <w:name w:val="heading 8"/>
-    <w:basedOn w:val="Normal"/>
-    <w:next w:val="Normal"/>
-    <w:link w:val="Heading8Char"/>
+    <w:basedOn w:val="a"/>
+    <w:next w:val="a"/>
+    <w:link w:val="80"/>
     <w:uiPriority w:val="9"/>
     <w:semiHidden/>
     <w:unhideWhenUsed/>
@@ -4790,11 +4910,11 @@
       <w:color w:val="595959" w:themeColor="text1" w:themeTint="A6"/>
     </w:rPr>
   </w:style>
-  <w:style w:type="paragraph" w:styleId="Heading9">
+  <w:style w:type="paragraph" w:styleId="9">
     <w:name w:val="heading 9"/>
-    <w:basedOn w:val="Normal"/>
-    <w:next w:val="Normal"/>
-    <w:link w:val="Heading9Char"/>
+    <w:basedOn w:val="a"/>
+    <w:next w:val="a"/>
+    <w:link w:val="90"/>
     <w:uiPriority w:val="9"/>
     <w:semiHidden/>
     <w:unhideWhenUsed/>
@@ -4811,13 +4931,13 @@
       <w:color w:val="595959" w:themeColor="text1" w:themeTint="A6"/>
     </w:rPr>
   </w:style>
-  <w:style w:type="character" w:default="1" w:styleId="DefaultParagraphFont">
+  <w:style w:type="character" w:default="1" w:styleId="a0">
     <w:name w:val="Default Paragraph Font"/>
     <w:uiPriority w:val="1"/>
     <w:semiHidden/>
     <w:unhideWhenUsed/>
   </w:style>
-  <w:style w:type="table" w:default="1" w:styleId="TableNormal">
+  <w:style w:type="table" w:default="1" w:styleId="a1">
     <w:name w:val="Normal Table"/>
     <w:uiPriority w:val="99"/>
     <w:semiHidden/>
@@ -4832,16 +4952,16 @@
       </w:tblCellMar>
     </w:tblPr>
   </w:style>
-  <w:style w:type="numbering" w:default="1" w:styleId="NoList">
+  <w:style w:type="numbering" w:default="1" w:styleId="a2">
     <w:name w:val="No List"/>
     <w:uiPriority w:val="99"/>
     <w:semiHidden/>
     <w:unhideWhenUsed/>
   </w:style>
-  <w:style w:type="character" w:customStyle="1" w:styleId="Heading1Char">
-    <w:name w:val="Heading 1 Char"/>
-    <w:basedOn w:val="DefaultParagraphFont"/>
-    <w:link w:val="Heading1"/>
+  <w:style w:type="character" w:customStyle="1" w:styleId="10">
+    <w:name w:val="标题 1 字符"/>
+    <w:basedOn w:val="a0"/>
+    <w:link w:val="1"/>
     <w:uiPriority w:val="9"/>
     <w:rsid w:val="00005A1C"/>
     <w:rPr>
@@ -4851,10 +4971,10 @@
       <w:szCs w:val="48"/>
     </w:rPr>
   </w:style>
-  <w:style w:type="character" w:customStyle="1" w:styleId="Heading2Char">
-    <w:name w:val="Heading 2 Char"/>
-    <w:basedOn w:val="DefaultParagraphFont"/>
-    <w:link w:val="Heading2"/>
+  <w:style w:type="character" w:customStyle="1" w:styleId="20">
+    <w:name w:val="标题 2 字符"/>
+    <w:basedOn w:val="a0"/>
+    <w:link w:val="2"/>
     <w:uiPriority w:val="9"/>
     <w:semiHidden/>
     <w:rsid w:val="00005A1C"/>
@@ -4865,10 +4985,10 @@
       <w:szCs w:val="40"/>
     </w:rPr>
   </w:style>
-  <w:style w:type="character" w:customStyle="1" w:styleId="Heading3Char">
-    <w:name w:val="Heading 3 Char"/>
-    <w:basedOn w:val="DefaultParagraphFont"/>
-    <w:link w:val="Heading3"/>
+  <w:style w:type="character" w:customStyle="1" w:styleId="30">
+    <w:name w:val="标题 3 字符"/>
+    <w:basedOn w:val="a0"/>
+    <w:link w:val="3"/>
     <w:uiPriority w:val="9"/>
     <w:semiHidden/>
     <w:rsid w:val="00005A1C"/>
@@ -4879,10 +4999,10 @@
       <w:szCs w:val="32"/>
     </w:rPr>
   </w:style>
-  <w:style w:type="character" w:customStyle="1" w:styleId="Heading4Char">
-    <w:name w:val="Heading 4 Char"/>
-    <w:basedOn w:val="DefaultParagraphFont"/>
-    <w:link w:val="Heading4"/>
+  <w:style w:type="character" w:customStyle="1" w:styleId="40">
+    <w:name w:val="标题 4 字符"/>
+    <w:basedOn w:val="a0"/>
+    <w:link w:val="4"/>
     <w:uiPriority w:val="9"/>
     <w:semiHidden/>
     <w:rsid w:val="00005A1C"/>
@@ -4893,10 +5013,10 @@
       <w:szCs w:val="28"/>
     </w:rPr>
   </w:style>
-  <w:style w:type="character" w:customStyle="1" w:styleId="Heading5Char">
-    <w:name w:val="Heading 5 Char"/>
-    <w:basedOn w:val="DefaultParagraphFont"/>
-    <w:link w:val="Heading5"/>
+  <w:style w:type="character" w:customStyle="1" w:styleId="50">
+    <w:name w:val="标题 5 字符"/>
+    <w:basedOn w:val="a0"/>
+    <w:link w:val="5"/>
     <w:uiPriority w:val="9"/>
     <w:semiHidden/>
     <w:rsid w:val="00005A1C"/>
@@ -4906,10 +5026,10 @@
       <w:sz w:val="24"/>
     </w:rPr>
   </w:style>
-  <w:style w:type="character" w:customStyle="1" w:styleId="Heading6Char">
-    <w:name w:val="Heading 6 Char"/>
-    <w:basedOn w:val="DefaultParagraphFont"/>
-    <w:link w:val="Heading6"/>
+  <w:style w:type="character" w:customStyle="1" w:styleId="60">
+    <w:name w:val="标题 6 字符"/>
+    <w:basedOn w:val="a0"/>
+    <w:link w:val="6"/>
     <w:uiPriority w:val="9"/>
     <w:semiHidden/>
     <w:rsid w:val="00005A1C"/>
@@ -4920,10 +5040,10 @@
       <w:color w:val="0F4761" w:themeColor="accent1" w:themeShade="BF"/>
     </w:rPr>
   </w:style>
-  <w:style w:type="character" w:customStyle="1" w:styleId="Heading7Char">
-    <w:name w:val="Heading 7 Char"/>
-    <w:basedOn w:val="DefaultParagraphFont"/>
-    <w:link w:val="Heading7"/>
+  <w:style w:type="character" w:customStyle="1" w:styleId="70">
+    <w:name w:val="标题 7 字符"/>
+    <w:basedOn w:val="a0"/>
+    <w:link w:val="7"/>
     <w:uiPriority w:val="9"/>
     <w:semiHidden/>
     <w:rsid w:val="00005A1C"/>
@@ -4934,10 +5054,10 @@
       <w:color w:val="595959" w:themeColor="text1" w:themeTint="A6"/>
     </w:rPr>
   </w:style>
-  <w:style w:type="character" w:customStyle="1" w:styleId="Heading8Char">
-    <w:name w:val="Heading 8 Char"/>
-    <w:basedOn w:val="DefaultParagraphFont"/>
-    <w:link w:val="Heading8"/>
+  <w:style w:type="character" w:customStyle="1" w:styleId="80">
+    <w:name w:val="标题 8 字符"/>
+    <w:basedOn w:val="a0"/>
+    <w:link w:val="8"/>
     <w:uiPriority w:val="9"/>
     <w:semiHidden/>
     <w:rsid w:val="00005A1C"/>
@@ -4946,10 +5066,10 @@
       <w:color w:val="595959" w:themeColor="text1" w:themeTint="A6"/>
     </w:rPr>
   </w:style>
-  <w:style w:type="character" w:customStyle="1" w:styleId="Heading9Char">
-    <w:name w:val="Heading 9 Char"/>
-    <w:basedOn w:val="DefaultParagraphFont"/>
-    <w:link w:val="Heading9"/>
+  <w:style w:type="character" w:customStyle="1" w:styleId="90">
+    <w:name w:val="标题 9 字符"/>
+    <w:basedOn w:val="a0"/>
+    <w:link w:val="9"/>
     <w:uiPriority w:val="9"/>
     <w:semiHidden/>
     <w:rsid w:val="00005A1C"/>
@@ -4958,11 +5078,11 @@
       <w:color w:val="595959" w:themeColor="text1" w:themeTint="A6"/>
     </w:rPr>
   </w:style>
-  <w:style w:type="paragraph" w:styleId="Title">
+  <w:style w:type="paragraph" w:styleId="a3">
     <w:name w:val="Title"/>
-    <w:basedOn w:val="Normal"/>
-    <w:next w:val="Normal"/>
-    <w:link w:val="TitleChar"/>
+    <w:basedOn w:val="a"/>
+    <w:next w:val="a"/>
+    <w:link w:val="a4"/>
     <w:uiPriority w:val="10"/>
     <w:qFormat/>
     <w:rsid w:val="00005A1C"/>
@@ -4979,10 +5099,10 @@
       <w:szCs w:val="56"/>
     </w:rPr>
   </w:style>
-  <w:style w:type="character" w:customStyle="1" w:styleId="TitleChar">
-    <w:name w:val="Title Char"/>
-    <w:basedOn w:val="DefaultParagraphFont"/>
-    <w:link w:val="Title"/>
+  <w:style w:type="character" w:customStyle="1" w:styleId="a4">
+    <w:name w:val="标题 字符"/>
+    <w:basedOn w:val="a0"/>
+    <w:link w:val="a3"/>
     <w:uiPriority w:val="10"/>
     <w:rsid w:val="00005A1C"/>
     <w:rPr>
@@ -4993,11 +5113,11 @@
       <w:szCs w:val="56"/>
     </w:rPr>
   </w:style>
-  <w:style w:type="paragraph" w:styleId="Subtitle">
+  <w:style w:type="paragraph" w:styleId="a5">
     <w:name w:val="Subtitle"/>
-    <w:basedOn w:val="Normal"/>
-    <w:next w:val="Normal"/>
-    <w:link w:val="SubtitleChar"/>
+    <w:basedOn w:val="a"/>
+    <w:next w:val="a"/>
+    <w:link w:val="a6"/>
     <w:uiPriority w:val="11"/>
     <w:qFormat/>
     <w:rsid w:val="00005A1C"/>
@@ -5015,10 +5135,10 @@
       <w:szCs w:val="28"/>
     </w:rPr>
   </w:style>
-  <w:style w:type="character" w:customStyle="1" w:styleId="SubtitleChar">
-    <w:name w:val="Subtitle Char"/>
-    <w:basedOn w:val="DefaultParagraphFont"/>
-    <w:link w:val="Subtitle"/>
+  <w:style w:type="character" w:customStyle="1" w:styleId="a6">
+    <w:name w:val="副标题 字符"/>
+    <w:basedOn w:val="a0"/>
+    <w:link w:val="a5"/>
     <w:uiPriority w:val="11"/>
     <w:rsid w:val="00005A1C"/>
     <w:rPr>
@@ -5029,11 +5149,11 @@
       <w:szCs w:val="28"/>
     </w:rPr>
   </w:style>
-  <w:style w:type="paragraph" w:styleId="Quote">
+  <w:style w:type="paragraph" w:styleId="a7">
     <w:name w:val="Quote"/>
-    <w:basedOn w:val="Normal"/>
-    <w:next w:val="Normal"/>
-    <w:link w:val="QuoteChar"/>
+    <w:basedOn w:val="a"/>
+    <w:next w:val="a"/>
+    <w:link w:val="a8"/>
     <w:uiPriority w:val="29"/>
     <w:qFormat/>
     <w:rsid w:val="00005A1C"/>
@@ -5047,10 +5167,10 @@
       <w:color w:val="404040" w:themeColor="text1" w:themeTint="BF"/>
     </w:rPr>
   </w:style>
-  <w:style w:type="character" w:customStyle="1" w:styleId="QuoteChar">
-    <w:name w:val="Quote Char"/>
-    <w:basedOn w:val="DefaultParagraphFont"/>
-    <w:link w:val="Quote"/>
+  <w:style w:type="character" w:customStyle="1" w:styleId="a8">
+    <w:name w:val="引用 字符"/>
+    <w:basedOn w:val="a0"/>
+    <w:link w:val="a7"/>
     <w:uiPriority w:val="29"/>
     <w:rsid w:val="00005A1C"/>
     <w:rPr>
@@ -5059,9 +5179,9 @@
       <w:color w:val="404040" w:themeColor="text1" w:themeTint="BF"/>
     </w:rPr>
   </w:style>
-  <w:style w:type="paragraph" w:styleId="ListParagraph">
+  <w:style w:type="paragraph" w:styleId="a9">
     <w:name w:val="List Paragraph"/>
-    <w:basedOn w:val="Normal"/>
+    <w:basedOn w:val="a"/>
     <w:uiPriority w:val="34"/>
     <w:qFormat/>
     <w:rsid w:val="00005A1C"/>
@@ -5070,9 +5190,9 @@
       <w:contextualSpacing/>
     </w:pPr>
   </w:style>
-  <w:style w:type="character" w:styleId="IntenseEmphasis">
+  <w:style w:type="character" w:styleId="aa">
     <w:name w:val="Intense Emphasis"/>
-    <w:basedOn w:val="DefaultParagraphFont"/>
+    <w:basedOn w:val="a0"/>
     <w:uiPriority w:val="21"/>
     <w:qFormat/>
     <w:rsid w:val="00005A1C"/>
@@ -5082,11 +5202,11 @@
       <w:color w:val="0F4761" w:themeColor="accent1" w:themeShade="BF"/>
     </w:rPr>
   </w:style>
-  <w:style w:type="paragraph" w:styleId="IntenseQuote">
+  <w:style w:type="paragraph" w:styleId="ab">
     <w:name w:val="Intense Quote"/>
-    <w:basedOn w:val="Normal"/>
-    <w:next w:val="Normal"/>
-    <w:link w:val="IntenseQuoteChar"/>
+    <w:basedOn w:val="a"/>
+    <w:next w:val="a"/>
+    <w:link w:val="ac"/>
     <w:uiPriority w:val="30"/>
     <w:qFormat/>
     <w:rsid w:val="00005A1C"/>
@@ -5105,10 +5225,10 @@
       <w:color w:val="0F4761" w:themeColor="accent1" w:themeShade="BF"/>
     </w:rPr>
   </w:style>
-  <w:style w:type="character" w:customStyle="1" w:styleId="IntenseQuoteChar">
-    <w:name w:val="Intense Quote Char"/>
-    <w:basedOn w:val="DefaultParagraphFont"/>
-    <w:link w:val="IntenseQuote"/>
+  <w:style w:type="character" w:customStyle="1" w:styleId="ac">
+    <w:name w:val="明显引用 字符"/>
+    <w:basedOn w:val="a0"/>
+    <w:link w:val="ab"/>
     <w:uiPriority w:val="30"/>
     <w:rsid w:val="00005A1C"/>
     <w:rPr>
@@ -5117,9 +5237,9 @@
       <w:color w:val="0F4761" w:themeColor="accent1" w:themeShade="BF"/>
     </w:rPr>
   </w:style>
-  <w:style w:type="character" w:styleId="IntenseReference">
+  <w:style w:type="character" w:styleId="ad">
     <w:name w:val="Intense Reference"/>
-    <w:basedOn w:val="DefaultParagraphFont"/>
+    <w:basedOn w:val="a0"/>
     <w:uiPriority w:val="32"/>
     <w:qFormat/>
     <w:rsid w:val="00005A1C"/>
@@ -5131,9 +5251,9 @@
       <w:spacing w:val="5"/>
     </w:rPr>
   </w:style>
-  <w:style w:type="character" w:styleId="PlaceholderText">
+  <w:style w:type="character" w:styleId="ae">
     <w:name w:val="Placeholder Text"/>
-    <w:basedOn w:val="DefaultParagraphFont"/>
+    <w:basedOn w:val="a0"/>
     <w:uiPriority w:val="99"/>
     <w:semiHidden/>
     <w:rsid w:val="002D3C05"/>
@@ -5143,7 +5263,7 @@
   </w:style>
   <w:style w:type="paragraph" w:customStyle="1" w:styleId="font-claude-response-body">
     <w:name w:val="font-claude-response-body"/>
-    <w:basedOn w:val="Normal"/>
+    <w:basedOn w:val="a"/>
     <w:rsid w:val="00F26A61"/>
     <w:pPr>
       <w:widowControl/>
@@ -5156,9 +5276,9 @@
       <w14:ligatures w14:val="none"/>
     </w:rPr>
   </w:style>
-  <w:style w:type="character" w:styleId="Strong">
+  <w:style w:type="character" w:styleId="af">
     <w:name w:val="Strong"/>
-    <w:basedOn w:val="DefaultParagraphFont"/>
+    <w:basedOn w:val="a0"/>
     <w:uiPriority w:val="22"/>
     <w:qFormat/>
     <w:rsid w:val="00F26A61"/>
@@ -5167,9 +5287,9 @@
       <w:bCs/>
     </w:rPr>
   </w:style>
-  <w:style w:type="character" w:styleId="HTMLCode">
+  <w:style w:type="character" w:styleId="HTML">
     <w:name w:val="HTML Code"/>
-    <w:basedOn w:val="DefaultParagraphFont"/>
+    <w:basedOn w:val="a0"/>
     <w:uiPriority w:val="99"/>
     <w:semiHidden/>
     <w:unhideWhenUsed/>

</xml_diff>